<commit_message>
Karma testlerde bilgi kaynağı etiketlerini düzelt
150 sorunun "çıkmış bilgi / beklenen hüküm" etiketi, cevabı belirleyen
bilginin 2021-2025 sorularında ölçülüp ölçülmediğine göre yeniden
denetlendi:
- beklenen → çıkmış: K04-08 (2024/70, 2022/69), K02-07 (2023/89)
- çıkmış → beklenen: K03-07, K08-11, K09-10, K11-09
- referans düzeltmesi: K01-04, K01-08, K03-12, K04-05, K08-06, K11-05
Yeni dağılım: Test 1 20/30, Test 2 17/33, Test 3 20/30 (toplam 57/93).
Soru sırası, şıklar ve cevap anahtarı değişmedi. Benzerlik taraması
betikleri ve denetim raporu uretim-kayitlari'na eklendi.

Co-Authored-By: Claude Opus 5.5 <noreply@anthropic.com>
Claude-Session: https://claude.ai/code/session_01GgDEz86kKogUAFjPuHAFPg
</commit_message>
<xml_diff>
--- a/02-KONU-SINIFLARI-HAP-VE-KARMA-TESTLER/00-OKU-BENI.docx
+++ b/02-KONU-SINIFLARI-HAP-VE-KARMA-TESTLER/00-OKU-BENI.docx
@@ -1462,7 +1462,7 @@
               <w:jc w:val="left"/>
             </w:pPr>
             <w:r>
-              <w:t xml:space="preserve">22 / 28</w:t>
+              <w:t xml:space="preserve">20 / 30</w:t>
             </w:r>
           </w:p>
         </w:tc>
@@ -1607,7 +1607,7 @@
         <w:t xml:space="preserve"> </w:t>
       </w:r>
       <w:r>
-        <w:t xml:space="preserve">yazan soru, o çıkmış sorunun ölçtüğü bilgiyi</w:t>
+        <w:t xml:space="preserve">yazan soru, o çıkmış sorunun ölçtüğü bilgiyi (aynı hükmü ya da aynı mevzuat listesini)</w:t>
       </w:r>
       <w:r>
         <w:t xml:space="preserve"> </w:t>
@@ -1623,7 +1623,7 @@
         <w:t xml:space="preserve"> </w:t>
       </w:r>
       <w:r>
-        <w:t xml:space="preserve">sorar (kopya değildir);</w:t>
+        <w:t xml:space="preserve">sorar; kopya değildir.</w:t>
       </w:r>
       <w:r>
         <w:t xml:space="preserve"> </w:t>
@@ -1641,7 +1641,7 @@
         <w:t xml:space="preserve"> </w:t>
       </w:r>
       <w:r>
-        <w:t xml:space="preserve">yazan soru, 2021–2025’te hiç sorulmamış ve 02 numaralı dokümanda yer alan bir hükmü sorar.</w:t>
+        <w:t xml:space="preserve">yazan soru, cevabı belirleyen bilgisi 2021–2025’te hiç ölçülmemiş bir hükmü sorar. Üç testte toplam 57 çıkmış bilgi, 93 beklenen hüküm sorusu var.</w:t>
       </w:r>
     </w:p>
     <w:p>
@@ -1986,6 +1986,46 @@
       </w:r>
       <w:r>
         <w:t xml:space="preserve">Her test 50 sorusuyla baştan sona, anahtara bakmadan çözüldü. Anahtar hatası çıkmadı. 11 soruda test içi tekrar ya da sızıntı, şık konumuna kalmış atıf, vurgusuz olumsuz kök ve güncellik düzeltmesi yapıldı (1 soru yeniden yazıldı).</w:t>
+      </w:r>
+    </w:p>
+    <w:p>
+      <w:pPr>
+        <w:numPr>
+          <w:ilvl w:val="0"/>
+          <w:numId w:val="1004"/>
+        </w:numPr>
+        <w:pStyle w:val="Compact"/>
+      </w:pPr>
+      <w:r>
+        <w:rPr>
+          <w:bCs/>
+          <w:b/>
+        </w:rPr>
+        <w:t xml:space="preserve">Bilgi kaynağı etiketi denetimi:</w:t>
+      </w:r>
+      <w:r>
+        <w:t xml:space="preserve"> </w:t>
+      </w:r>
+      <w:r>
+        <w:t xml:space="preserve">150 sorunun her birinin</w:t>
+      </w:r>
+      <w:r>
+        <w:t xml:space="preserve"> </w:t>
+      </w:r>
+      <w:r>
+        <w:t xml:space="preserve">“</w:t>
+      </w:r>
+      <w:r>
+        <w:t xml:space="preserve">çıkmış bilgi / beklenen hüküm</w:t>
+      </w:r>
+      <w:r>
+        <w:t xml:space="preserve">”</w:t>
+      </w:r>
+      <w:r>
+        <w:t xml:space="preserve"> </w:t>
+      </w:r>
+      <w:r>
+        <w:t xml:space="preserve">etiketi, cevabı belirleyen bilginin 2021–2025 sorularında ölçülüp ölçülmediğine bakılarak yeniden kontrol edildi. 6 sorunun etiketi değişti (2’si beklenen → çıkmış, 4’ü çıkmış → beklenen), 6 sorunun çıkmış soru referansı düzeltildi. Metin benzerliği taramasında testler kendi aralarında, önceki 3 denemeyle ve 500 çıkmış soruyla kopya ya da birbirine yakın soru çıkmadı.</w:t>
       </w:r>
     </w:p>
     <w:bookmarkEnd w:id="25"/>

</xml_diff>

<commit_message>
Hesaplamayı ayrı konu say: konu sınıfları ve hap dokümanları
Analizdeki alan ayrımına uygun olarak 59 hesap sorusu içerik konusuna
(kıymet, KDV, ceza…) değil ayrı "Hesaplama" konusuna sayıldı:
- Hesaplama 59 (çok çıkan, en büyük konu); Gümrük Kıymeti 47 → 15,
  KDV 13 → 4 (az), ÖTV 14 → 10, Cezalar 8 → 3 (az), TPS 5 → 4 (az),
  Antrepo 17 → 15, Kambiyo 17 → 16, Geçici İthalat 11 → 10,
  İthalat Rejimi 7 → 5, Uzlaşma 3 → 1.
- Sınıflar: 16 çok / 26 orta / 23 az / 12 hiç çıkmayan (77 konu).
- 01 dokümanında hesap hapları Hesaplama bölümüne taşındı (hesap
  türüne göre gruplu, 565 hap); değişen konuların özetleri yeni
  sayılarla yazıldı. 02 ve 03'te Hesaplama için yönlendirme ve tablo
  satırı eklendi.
Karma testler bu sınıflamaya göre ayrı bir committe güncellenecek.

Co-Authored-By: Claude Opus 5.5 <noreply@anthropic.com>
Claude-Session: https://claude.ai/code/session_01GgDEz86kKogUAFjPuHAFPg
</commit_message>
<xml_diff>
--- a/02-KONU-SINIFLARI-HAP-VE-KARMA-TESTLER/00-OKU-BENI.docx
+++ b/02-KONU-SINIFLARI-HAP-VE-KARMA-TESTLER/00-OKU-BENI.docx
@@ -16,7 +16,7 @@
         <w:pStyle w:val="FirstParagraph"/>
       </w:pPr>
       <w:r>
-        <w:t xml:space="preserve">Bu klasör, 2021–2025 Gümrük Müşavirliği sınavlarının 500 sorusunu konu konu sayarak 76 konuyu dört sınıfa ayırır:</w:t>
+        <w:t xml:space="preserve">Bu klasör, 2021–2025 Gümrük Müşavirliği sınavlarının 500 sorusunu konu konu sayarak 77 konuyu dört sınıfa ayırır:</w:t>
       </w:r>
       <w:r>
         <w:t xml:space="preserve"> </w:t>
@@ -207,7 +207,7 @@
               <w:t xml:space="preserve"> </w:t>
             </w:r>
             <w:r>
-              <w:t xml:space="preserve">(.pdf / .docx, 69 sayfa)</w:t>
+              <w:t xml:space="preserve">(.pdf / .docx, 71 sayfa)</w:t>
             </w:r>
           </w:p>
         </w:tc>
@@ -232,7 +232,7 @@
               <w:t xml:space="preserve">çıkmış sorulardan hap bilgi</w:t>
             </w:r>
             <w:r>
-              <w:t xml:space="preserve">: 559 hap, her biri hangi soruda çıktığıyla (ör.</w:t>
+              <w:t xml:space="preserve">: 565 hap (Hesaplama bölümü kıymet, KDV matrahı, ceza, ÖTV, uzlaşma, antrepo teminatı, İGV/MIN-MAX ve diğer hesaplar diye gruplu), her biri hangi soruda çıktığıyla (ör.</w:t>
             </w:r>
             <w:r>
               <w:t xml:space="preserve"> </w:t>
@@ -343,7 +343,7 @@
               <w:t xml:space="preserve"> </w:t>
             </w:r>
             <w:r>
-              <w:t xml:space="preserve">(.pdf / .docx, 332 sayfa)</w:t>
+              <w:t xml:space="preserve">(.pdf / .docx, 333 sayfa)</w:t>
             </w:r>
           </w:p>
         </w:tc>
@@ -577,7 +577,7 @@
               <w:t xml:space="preserve"> </w:t>
             </w:r>
             <w:r>
-              <w:t xml:space="preserve">(76 konu, yıl yıl sayım, sınıf, eğilim, soru listesi),</w:t>
+              <w:t xml:space="preserve">(77 konu — Hesaplama dahil —, yıl yıl sayım, sınıf, eğilim, soru listesi),</w:t>
             </w:r>
             <w:r>
               <w:t xml:space="preserve"> </w:t>
@@ -592,7 +592,22 @@
               <w:t xml:space="preserve"> </w:t>
             </w:r>
             <w:r>
-              <w:t xml:space="preserve">(500 sorunun konu kodu),</w:t>
+              <w:t xml:space="preserve">(500 sorunun alanı ve içerik konusu;</w:t>
+            </w:r>
+            <w:r>
+              <w:t xml:space="preserve"> </w:t>
+            </w:r>
+            <w:r>
+              <w:rPr>
+                <w:rStyle w:val="VerbatimChar"/>
+              </w:rPr>
+              <w:t xml:space="preserve">alan: HESAP</w:t>
+            </w:r>
+            <w:r>
+              <w:t xml:space="preserve"> </w:t>
+            </w:r>
+            <w:r>
+              <w:t xml:space="preserve">olanlar Hesaplama konusuna sayılır),</w:t>
             </w:r>
             <w:r>
               <w:t xml:space="preserve"> </w:t>
@@ -673,6 +688,72 @@
     <w:p>
       <w:pPr>
         <w:pStyle w:val="FirstParagraph"/>
+      </w:pPr>
+      <w:r>
+        <w:t xml:space="preserve">Sayım, analizdeki alan ayrımıyla aynıdır (Gümrük Mevzuatı 222 · Sair Mevzuat 143 · Tarife 76 · Hesaplama 59).</w:t>
+      </w:r>
+      <w:r>
+        <w:t xml:space="preserve"> </w:t>
+      </w:r>
+      <w:r>
+        <w:rPr>
+          <w:bCs/>
+          <w:b/>
+        </w:rPr>
+        <w:t xml:space="preserve">Hesap soruları içerik konusuna değil ayrı</w:t>
+      </w:r>
+      <w:r>
+        <w:rPr>
+          <w:bCs/>
+          <w:b/>
+        </w:rPr>
+        <w:t xml:space="preserve"> </w:t>
+      </w:r>
+      <w:r>
+        <w:rPr>
+          <w:bCs/>
+          <w:b/>
+        </w:rPr>
+        <w:t xml:space="preserve">“</w:t>
+      </w:r>
+      <w:r>
+        <w:rPr>
+          <w:bCs/>
+          <w:b/>
+        </w:rPr>
+        <w:t xml:space="preserve">Hesaplama</w:t>
+      </w:r>
+      <w:r>
+        <w:rPr>
+          <w:bCs/>
+          <w:b/>
+        </w:rPr>
+        <w:t xml:space="preserve">”</w:t>
+      </w:r>
+      <w:r>
+        <w:rPr>
+          <w:bCs/>
+          <w:b/>
+        </w:rPr>
+        <w:t xml:space="preserve"> </w:t>
+      </w:r>
+      <w:r>
+        <w:rPr>
+          <w:bCs/>
+          <w:b/>
+        </w:rPr>
+        <w:t xml:space="preserve">konusuna sayıldı:</w:t>
+      </w:r>
+      <w:r>
+        <w:t xml:space="preserve"> </w:t>
+      </w:r>
+      <w:r>
+        <w:t xml:space="preserve">Gümrük Kıymeti, KDV, ÖTV, Cezalar gibi konuların sayıları yalnız sözel sorulardır (ör. Gümrük Kıymeti 15 sözel soru; kıymet hesabı 32 soru Hesaplama’da).</w:t>
+      </w:r>
+    </w:p>
+    <w:p>
+      <w:pPr>
+        <w:pStyle w:val="BodyText"/>
       </w:pPr>
       <w:r>
         <w:t xml:space="preserve">Sınıf sınırları:</w:t>
@@ -859,19 +940,29 @@
               <w:jc w:val="left"/>
             </w:pPr>
             <w:r>
-              <w:t xml:space="preserve">261</w:t>
-            </w:r>
-          </w:p>
-        </w:tc>
-        <w:tc>
-          <w:tcPr/>
-          <w:p>
-            <w:pPr>
-              <w:pStyle w:val="Compact"/>
-              <w:jc w:val="left"/>
-            </w:pPr>
-            <w:r>
-              <w:t xml:space="preserve">Gümrük Kıymeti 47 · Kaçakçılık (5607) 22 · Transit 21 · Antrepo 17 · Tercihli Menşe İspat Belgeleri 17 · Kambiyo 17 · Muafiyetler 16 · ÖTV 14 · KDV 13 · Tarife Fasıl 1–24 12 · Dahilde İşleme 12 · İhracat Rejimi 12 · Geçici İthalat 11 · Tarife Fasıl 84–85 10 · Tarife Cetvel Yapısı/GTİP 10 · Posta ve Hızlı Kargo 10</w:t>
+              <w:t xml:space="preserve">267</w:t>
+            </w:r>
+          </w:p>
+        </w:tc>
+        <w:tc>
+          <w:tcPr/>
+          <w:p>
+            <w:pPr>
+              <w:pStyle w:val="Compact"/>
+              <w:jc w:val="left"/>
+            </w:pPr>
+            <w:r>
+              <w:rPr>
+                <w:bCs/>
+                <w:b/>
+              </w:rPr>
+              <w:t xml:space="preserve">Hesaplama 59</w:t>
+            </w:r>
+            <w:r>
+              <w:t xml:space="preserve"> </w:t>
+            </w:r>
+            <w:r>
+              <w:t xml:space="preserve">(kıymet hesabı 32, KDV matrahı 9, ceza 5, ÖTV 4, uzlaşma 2, antrepo teminatı 2, İGV ve MIN/MAX 2, diğer 3) · Kaçakçılık (5607) 22 · Transit 21 · Tercihli Menşe İspat Belgeleri 17 · Muafiyetler 16 · Kambiyo 16 · Antrepo 15 · Gümrük Kıymeti 15 · Tarife Fasıl 1–24 12 · Dahilde İşleme 12 · İhracat Rejimi 12 · Geçici İthalat 10 · Tarife Fasıl 84–85 10 · ÖTV 10 · Tarife Cetvel Yapısı/GTİP 10 · Posta ve Hızlı Kargo 10</w:t>
             </w:r>
           </w:p>
         </w:tc>
@@ -897,31 +988,31 @@
               <w:jc w:val="left"/>
             </w:pPr>
             <w:r>
-              <w:t xml:space="preserve">28</w:t>
-            </w:r>
-          </w:p>
-        </w:tc>
-        <w:tc>
-          <w:tcPr/>
-          <w:p>
-            <w:pPr>
-              <w:pStyle w:val="Compact"/>
-              <w:jc w:val="left"/>
-            </w:pPr>
-            <w:r>
-              <w:t xml:space="preserve">183</w:t>
-            </w:r>
-          </w:p>
-        </w:tc>
-        <w:tc>
-          <w:tcPr/>
-          <w:p>
-            <w:pPr>
-              <w:pStyle w:val="Compact"/>
-              <w:jc w:val="left"/>
-            </w:pPr>
-            <w:r>
-              <w:t xml:space="preserve">YYS ve Yerinde Gümrükleme, Cezalar, Geri Gelen Eşya, Incoterms, TIR, STA/TTA, HS 2022, Gümrük Birliği, İthalat Rejimi ve İGV, Fikri Haklar, Ürün Güvenliği, GYKK, Özet Beyan, Beyan, Müşavirlik, Tercihsiz Menşe, Kumanya, DTÖ, Hariçte İşleme, Geri Verme, KKDF ve diğer tarife fasıl grupları</w:t>
+              <w:t xml:space="preserve">26</w:t>
+            </w:r>
+          </w:p>
+        </w:tc>
+        <w:tc>
+          <w:tcPr/>
+          <w:p>
+            <w:pPr>
+              <w:pStyle w:val="Compact"/>
+              <w:jc w:val="left"/>
+            </w:pPr>
+            <w:r>
+              <w:t xml:space="preserve">168</w:t>
+            </w:r>
+          </w:p>
+        </w:tc>
+        <w:tc>
+          <w:tcPr/>
+          <w:p>
+            <w:pPr>
+              <w:pStyle w:val="Compact"/>
+              <w:jc w:val="left"/>
+            </w:pPr>
+            <w:r>
+              <w:t xml:space="preserve">YYS ve Yerinde Gümrükleme, Geri Gelen Eşya, Incoterms, TIR, STA/TTA, HS 2022, Gümrük Birliği, Fikri Haklar, Ürün Güvenliği, GYKK, Özet Beyan, Beyan, Müşavirlik, Tercihsiz Menşe, İhracat, Kumanya, DTÖ, Hariçte İşleme, Geri Verme, KKDF, İthalat Rejimi ve İGV, Genel Hükümler ve diğer tarife fasıl grupları</w:t>
             </w:r>
           </w:p>
         </w:tc>
@@ -947,31 +1038,70 @@
               <w:jc w:val="left"/>
             </w:pPr>
             <w:r>
-              <w:t xml:space="preserve">20</w:t>
-            </w:r>
-          </w:p>
-        </w:tc>
-        <w:tc>
-          <w:tcPr/>
-          <w:p>
-            <w:pPr>
-              <w:pStyle w:val="Compact"/>
-              <w:jc w:val="left"/>
-            </w:pPr>
-            <w:r>
-              <w:t xml:space="preserve">56</w:t>
-            </w:r>
-          </w:p>
-        </w:tc>
-        <w:tc>
-          <w:tcPr/>
-          <w:p>
-            <w:pPr>
-              <w:pStyle w:val="Compact"/>
-              <w:jc w:val="left"/>
-            </w:pPr>
-            <w:r>
-              <w:t xml:space="preserve">Serbest Dolaşım ve Nihai Kullanım, Teminat ve Faiz, Geçici Depolama, Ödeme Şekilleri, Tahakkuk-Tebliğ-Zamanaşımı, YGM, Muayene, Onaylanmış Kişi, Uzlaşma, Sınır Ticareti, Yatırım Teşvik, Damga Vergisi, Gümrüksüz Satış, BTB/BMB, Yükümlülük, Tasfiye, Serbest Bölgeler, İtiraz…</w:t>
+              <w:t xml:space="preserve">23</w:t>
+            </w:r>
+          </w:p>
+        </w:tc>
+        <w:tc>
+          <w:tcPr/>
+          <w:p>
+            <w:pPr>
+              <w:pStyle w:val="Compact"/>
+              <w:jc w:val="left"/>
+            </w:pPr>
+            <w:r>
+              <w:t xml:space="preserve">65</w:t>
+            </w:r>
+          </w:p>
+        </w:tc>
+        <w:tc>
+          <w:tcPr/>
+          <w:p>
+            <w:pPr>
+              <w:pStyle w:val="Compact"/>
+              <w:jc w:val="left"/>
+            </w:pPr>
+            <w:r>
+              <w:t xml:space="preserve">Serbest Dolaşım ve Nihai Kullanım,</w:t>
+            </w:r>
+            <w:r>
+              <w:t xml:space="preserve"> </w:t>
+            </w:r>
+            <w:r>
+              <w:rPr>
+                <w:bCs/>
+                <w:b/>
+              </w:rPr>
+              <w:t xml:space="preserve">KDV (sözel 4)</w:t>
+            </w:r>
+            <w:r>
+              <w:t xml:space="preserve">, Tarife Taşıtlar, Teminat ve Faiz, Geçici Depolama,</w:t>
+            </w:r>
+            <w:r>
+              <w:t xml:space="preserve"> </w:t>
+            </w:r>
+            <w:r>
+              <w:rPr>
+                <w:bCs/>
+                <w:b/>
+              </w:rPr>
+              <w:t xml:space="preserve">Ticaret Politikası Savunma Araçları</w:t>
+            </w:r>
+            <w:r>
+              <w:t xml:space="preserve">, Ödeme Şekilleri, Tahakkuk-Tebliğ-Zamanaşımı, YGM,</w:t>
+            </w:r>
+            <w:r>
+              <w:t xml:space="preserve"> </w:t>
+            </w:r>
+            <w:r>
+              <w:rPr>
+                <w:bCs/>
+                <w:b/>
+              </w:rPr>
+              <w:t xml:space="preserve">Cezalar (sözel 3)</w:t>
+            </w:r>
+            <w:r>
+              <w:t xml:space="preserve">, Muayene, Onaylanmış Kişi, Sınır Ticareti, Tanımlar, Yatırım Teşvik, Damga Vergisi, Gümrüksüz Satış, BTB/BMB, Yükümlülük, Tasfiye, Serbest Bölgeler, Uzlaşma, İtiraz</w:t>
             </w:r>
           </w:p>
         </w:tc>
@@ -1859,7 +1989,25 @@
         <w:t xml:space="preserve"> </w:t>
       </w:r>
       <w:r>
-        <w:t xml:space="preserve">500 sorunun her biri 76 ince konudan birine atandı. Sorular, mevzuat dosyaları ve resmî anahtarlar konu dosyalarında toplandı.</w:t>
+        <w:t xml:space="preserve">500 sorunun her biri 76 ince içerik konusundan birine atandı; analizdeki alan ayrımına uygun olarak 59 hesap sorusu ayrıca</w:t>
+      </w:r>
+      <w:r>
+        <w:t xml:space="preserve"> </w:t>
+      </w:r>
+      <w:r>
+        <w:t xml:space="preserve">“</w:t>
+      </w:r>
+      <w:r>
+        <w:t xml:space="preserve">Hesaplama</w:t>
+      </w:r>
+      <w:r>
+        <w:t xml:space="preserve">”</w:t>
+      </w:r>
+      <w:r>
+        <w:t xml:space="preserve"> </w:t>
+      </w:r>
+      <w:r>
+        <w:t xml:space="preserve">konusunda sayıldı (toplam 77 konu). Sorular, mevzuat dosyaları ve resmî anahtarlar konu dosyalarında toplandı.</w:t>
       </w:r>
     </w:p>
     <w:p>
@@ -1881,7 +2029,7 @@
         <w:t xml:space="preserve"> </w:t>
       </w:r>
       <w:r>
-        <w:t xml:space="preserve">76 konu 14 kümeye ayrıldı. Her kümede bütün çıkmış sorular hap satırlarına dönüştürüldü; bir betik, her sorunun en az bir hapta geçtiğini denetledi (500/500).</w:t>
+        <w:t xml:space="preserve">76 içerik konusu 14 kümeye ayrıldı. Her kümede bütün çıkmış sorular hap satırlarına dönüştürüldü; hesap sorularının hapları Hesaplama bölümüne taşındı (hem hesap hem sözel soruya dayanan 6 hap iki yerde). Bir betik, her sorunun kendi konusunun haplarında geçtiğini denetledi (500/500).</w:t>
       </w:r>
     </w:p>
     <w:p>

</xml_diff>

<commit_message>
Karma testleri Hesaplama konusuna göre yeniden dağıt
Hesaplamanın ayrı konu (59 soru, en çok çıkan) sayılmasıyla test
dağılımı yeniden hesaplandı:
- Hesap soruları 14 → 19 (Test 1: 7, Test 2: 6, Test 3: 6); Test 2'de
  48-49 ortak veriye bağlı kıymet → KDV matrahı seti.
- Fazla kalan konulardan 9 soru çıkarıldı (Kıymet, Kambiyo, Dahilde
  İşleme, ÖTV ve Geçici İthalat'tan 1'er; KDV, Yatırım Teşvik, BTB,
  Yükümlülük'ten 1'er); yerine 5 hesap ve 4 sözel soru (Fikri Haklar,
  Ürün Güvenliği, Beyan, Antrepo) yazıldı, K05-12 Test 3'ten Test 2'ye
  taşındı.
- Yeni sorular bağımsız doğrulamadan ve kendi testleriyle çapraz
  kontrolden geçti; her test 30/13/6/1, her harf 10, konu sayıları
  yeni sınıflamanın hedefleriyle aynı.
- Bölüm B etiketleri hesap türüyle ("Hesaplama – Gümrük kıymeti
  hesabı · Çok çıkan (59 soru)"); açıklama dosyası ve veri güncellendi.

Co-Authored-By: Claude Opus 5.5 <noreply@anthropic.com>
Claude-Session: https://claude.ai/code/session_01GgDEz86kKogUAFjPuHAFPg
</commit_message>
<xml_diff>
--- a/02-KONU-SINIFLARI-HAP-VE-KARMA-TESTLER/00-OKU-BENI.docx
+++ b/02-KONU-SINIFLARI-HAP-VE-KARMA-TESTLER/00-OKU-BENI.docx
@@ -1382,7 +1382,20 @@
         <w:t xml:space="preserve"> </w:t>
       </w:r>
       <w:r>
-        <w:t xml:space="preserve">konu sorusu. Çok çıkan konuların soru sayısı 5 yıllık sıklıklarıyla orantılı (yükselen konulara küçük ek ağırlık); her hiç çıkmayan konu en fazla 1 soruyla geldi.</w:t>
+        <w:t xml:space="preserve">konu sorusu. Çok çıkan konuların soru sayısı 5 yıllık sıklıklarıyla orantılı (yükselen konulara küçük ek ağırlık); her hiç çıkmayan konu en fazla 1 soruyla geldi. En çok çıkan konu olan</w:t>
+      </w:r>
+      <w:r>
+        <w:t xml:space="preserve"> </w:t>
+      </w:r>
+      <w:r>
+        <w:rPr>
+          <w:bCs/>
+          <w:b/>
+        </w:rPr>
+        <w:t xml:space="preserve">Hesaplama</w:t>
+      </w:r>
+      <w:r>
+        <w:t xml:space="preserve">dan (59 soru) her testte 6–7 hesap sorusu var (toplam 19: kıymet 10, KDV matrahı 3, ceza 2, ÖTV, KKDF, İGV/MIN-MAX ve antrepo teminatı birer).</w:t>
       </w:r>
     </w:p>
     <w:tbl>
@@ -1468,31 +1481,31 @@
               <w:jc w:val="left"/>
             </w:pPr>
             <w:r>
-              <w:t xml:space="preserve">1–20 Gümrük Mevzuatı · 21–38 Sair · 39–45 Tarife · 46–50 Hesap</w:t>
-            </w:r>
-          </w:p>
-        </w:tc>
-        <w:tc>
-          <w:tcPr/>
-          <w:p>
-            <w:pPr>
-              <w:pStyle w:val="Compact"/>
-              <w:jc w:val="left"/>
-            </w:pPr>
-            <w:r>
-              <w:t xml:space="preserve">1–23 GM · 24–39 Sair · 40–46 Tarife · 47–50 Hesap</w:t>
-            </w:r>
-          </w:p>
-        </w:tc>
-        <w:tc>
-          <w:tcPr/>
-          <w:p>
-            <w:pPr>
-              <w:pStyle w:val="Compact"/>
-              <w:jc w:val="left"/>
-            </w:pPr>
-            <w:r>
-              <w:t xml:space="preserve">1–24 GM · 25–37 Sair · 38–45 Tarife · 46–50 Hesap</w:t>
+              <w:t xml:space="preserve">1–20 Gümrük Mevzuatı · 21–36 Sair · 37–43 Tarife · 44–50 Hesap</w:t>
+            </w:r>
+          </w:p>
+        </w:tc>
+        <w:tc>
+          <w:tcPr/>
+          <w:p>
+            <w:pPr>
+              <w:pStyle w:val="Compact"/>
+              <w:jc w:val="left"/>
+            </w:pPr>
+            <w:r>
+              <w:t xml:space="preserve">1–22 GM · 23–37 Sair · 38–44 Tarife · 45–50 Hesap</w:t>
+            </w:r>
+          </w:p>
+        </w:tc>
+        <w:tc>
+          <w:tcPr/>
+          <w:p>
+            <w:pPr>
+              <w:pStyle w:val="Compact"/>
+              <w:jc w:val="left"/>
+            </w:pPr>
+            <w:r>
+              <w:t xml:space="preserve">1–23 GM · 24–36 Sair · 37–44 Tarife · 45–50 Hesap</w:t>
             </w:r>
           </w:p>
         </w:tc>
@@ -1506,43 +1519,43 @@
               <w:jc w:val="left"/>
             </w:pPr>
             <w:r>
-              <w:t xml:space="preserve">Hiç çıkmayan konu sorusu</w:t>
-            </w:r>
-          </w:p>
-        </w:tc>
-        <w:tc>
-          <w:tcPr/>
-          <w:p>
-            <w:pPr>
-              <w:pStyle w:val="Compact"/>
-              <w:jc w:val="left"/>
-            </w:pPr>
-            <w:r>
-              <w:t xml:space="preserve">Kota ve Tarife Kontenjanı</w:t>
-            </w:r>
-          </w:p>
-        </w:tc>
-        <w:tc>
-          <w:tcPr/>
-          <w:p>
-            <w:pPr>
-              <w:pStyle w:val="Compact"/>
-              <w:jc w:val="left"/>
-            </w:pPr>
-            <w:r>
-              <w:t xml:space="preserve">Sonradan Kontrol</w:t>
-            </w:r>
-          </w:p>
-        </w:tc>
-        <w:tc>
-          <w:tcPr/>
-          <w:p>
-            <w:pPr>
-              <w:pStyle w:val="Compact"/>
-              <w:jc w:val="left"/>
-            </w:pPr>
-            <w:r>
-              <w:t xml:space="preserve">İhracat Sayılan Satış ve Teslimler (99/13812)</w:t>
+              <w:t xml:space="preserve">Hesap sorusu</w:t>
+            </w:r>
+          </w:p>
+        </w:tc>
+        <w:tc>
+          <w:tcPr/>
+          <w:p>
+            <w:pPr>
+              <w:pStyle w:val="Compact"/>
+              <w:jc w:val="left"/>
+            </w:pPr>
+            <w:r>
+              <w:t xml:space="preserve">7</w:t>
+            </w:r>
+          </w:p>
+        </w:tc>
+        <w:tc>
+          <w:tcPr/>
+          <w:p>
+            <w:pPr>
+              <w:pStyle w:val="Compact"/>
+              <w:jc w:val="left"/>
+            </w:pPr>
+            <w:r>
+              <w:t xml:space="preserve">6 (48–49 ortak veriye bağlı kıymet → KDV matrahı)</w:t>
+            </w:r>
+          </w:p>
+        </w:tc>
+        <w:tc>
+          <w:tcPr/>
+          <w:p>
+            <w:pPr>
+              <w:pStyle w:val="Compact"/>
+              <w:jc w:val="left"/>
+            </w:pPr>
+            <w:r>
+              <w:t xml:space="preserve">6</w:t>
             </w:r>
           </w:p>
         </w:tc>
@@ -1556,43 +1569,43 @@
               <w:jc w:val="left"/>
             </w:pPr>
             <w:r>
-              <w:t xml:space="preserve">Çıkmış bilgi alanı / beklenen hüküm</w:t>
-            </w:r>
-          </w:p>
-        </w:tc>
-        <w:tc>
-          <w:tcPr/>
-          <w:p>
-            <w:pPr>
-              <w:pStyle w:val="Compact"/>
-              <w:jc w:val="left"/>
-            </w:pPr>
-            <w:r>
-              <w:t xml:space="preserve">20 / 30</w:t>
-            </w:r>
-          </w:p>
-        </w:tc>
-        <w:tc>
-          <w:tcPr/>
-          <w:p>
-            <w:pPr>
-              <w:pStyle w:val="Compact"/>
-              <w:jc w:val="left"/>
-            </w:pPr>
-            <w:r>
-              <w:t xml:space="preserve">17 / 33</w:t>
-            </w:r>
-          </w:p>
-        </w:tc>
-        <w:tc>
-          <w:tcPr/>
-          <w:p>
-            <w:pPr>
-              <w:pStyle w:val="Compact"/>
-              <w:jc w:val="left"/>
-            </w:pPr>
-            <w:r>
-              <w:t xml:space="preserve">20 / 30</w:t>
+              <w:t xml:space="preserve">Hiç çıkmayan konu sorusu</w:t>
+            </w:r>
+          </w:p>
+        </w:tc>
+        <w:tc>
+          <w:tcPr/>
+          <w:p>
+            <w:pPr>
+              <w:pStyle w:val="Compact"/>
+              <w:jc w:val="left"/>
+            </w:pPr>
+            <w:r>
+              <w:t xml:space="preserve">Kota ve Tarife Kontenjanı</w:t>
+            </w:r>
+          </w:p>
+        </w:tc>
+        <w:tc>
+          <w:tcPr/>
+          <w:p>
+            <w:pPr>
+              <w:pStyle w:val="Compact"/>
+              <w:jc w:val="left"/>
+            </w:pPr>
+            <w:r>
+              <w:t xml:space="preserve">Sonradan Kontrol</w:t>
+            </w:r>
+          </w:p>
+        </w:tc>
+        <w:tc>
+          <w:tcPr/>
+          <w:p>
+            <w:pPr>
+              <w:pStyle w:val="Compact"/>
+              <w:jc w:val="left"/>
+            </w:pPr>
+            <w:r>
+              <w:t xml:space="preserve">İhracat Sayılan Satış ve Teslimler (99/13812)</w:t>
             </w:r>
           </w:p>
         </w:tc>
@@ -1606,6 +1619,56 @@
               <w:jc w:val="left"/>
             </w:pPr>
             <w:r>
+              <w:t xml:space="preserve">Çıkmış bilgi alanı / beklenen hüküm</w:t>
+            </w:r>
+          </w:p>
+        </w:tc>
+        <w:tc>
+          <w:tcPr/>
+          <w:p>
+            <w:pPr>
+              <w:pStyle w:val="Compact"/>
+              <w:jc w:val="left"/>
+            </w:pPr>
+            <w:r>
+              <w:t xml:space="preserve">21 / 29</w:t>
+            </w:r>
+          </w:p>
+        </w:tc>
+        <w:tc>
+          <w:tcPr/>
+          <w:p>
+            <w:pPr>
+              <w:pStyle w:val="Compact"/>
+              <w:jc w:val="left"/>
+            </w:pPr>
+            <w:r>
+              <w:t xml:space="preserve">19 / 31</w:t>
+            </w:r>
+          </w:p>
+        </w:tc>
+        <w:tc>
+          <w:tcPr/>
+          <w:p>
+            <w:pPr>
+              <w:pStyle w:val="Compact"/>
+              <w:jc w:val="left"/>
+            </w:pPr>
+            <w:r>
+              <w:t xml:space="preserve">22 / 28</w:t>
+            </w:r>
+          </w:p>
+        </w:tc>
+      </w:tr>
+      <w:tr>
+        <w:tc>
+          <w:tcPr/>
+          <w:p>
+            <w:pPr>
+              <w:pStyle w:val="Compact"/>
+              <w:jc w:val="left"/>
+            </w:pPr>
+            <w:r>
               <w:t xml:space="preserve">Zorluk (kolay · orta · zor)</w:t>
             </w:r>
           </w:p>
@@ -1630,19 +1693,19 @@
               <w:jc w:val="left"/>
             </w:pPr>
             <w:r>
-              <w:t xml:space="preserve">9 · 31 · 10</w:t>
-            </w:r>
-          </w:p>
-        </w:tc>
-        <w:tc>
-          <w:tcPr/>
-          <w:p>
-            <w:pPr>
-              <w:pStyle w:val="Compact"/>
-              <w:jc w:val="left"/>
-            </w:pPr>
-            <w:r>
-              <w:t xml:space="preserve">15 · 19 · 16</w:t>
+              <w:t xml:space="preserve">9 · 32 · 9</w:t>
+            </w:r>
+          </w:p>
+        </w:tc>
+        <w:tc>
+          <w:tcPr/>
+          <w:p>
+            <w:pPr>
+              <w:pStyle w:val="Compact"/>
+              <w:jc w:val="left"/>
+            </w:pPr>
+            <w:r>
+              <w:t xml:space="preserve">14 · 20 · 16</w:t>
             </w:r>
           </w:p>
         </w:tc>
@@ -1771,7 +1834,7 @@
         <w:t xml:space="preserve"> </w:t>
       </w:r>
       <w:r>
-        <w:t xml:space="preserve">yazan soru, cevabı belirleyen bilgisi 2021–2025’te hiç ölçülmemiş bir hükmü sorar. Üç testte toplam 57 çıkmış bilgi, 93 beklenen hüküm sorusu var.</w:t>
+        <w:t xml:space="preserve">yazan soru, cevabı belirleyen bilgisi 2021–2025’te hiç ölçülmemiş bir hükmü sorar. Üç testte toplam 62 çıkmış bilgi, 88 beklenen hüküm sorusu var.</w:t>
       </w:r>
     </w:p>
     <w:p>
@@ -2073,7 +2136,7 @@
         <w:t xml:space="preserve"> </w:t>
       </w:r>
       <w:r>
-        <w:t xml:space="preserve">150 soru konu slotlarına bölündü ve 14 kümede yazıldı. Hesap soruları çıkmış hesap sorularının iskeleti üzerine kuruldu.</w:t>
+        <w:t xml:space="preserve">150 soru konu slotlarına bölündü ve 14 kümede yazıldı (8. adımdaki güncellemeyle 16 küme). Hesap soruları çıkmış hesap sorularının iskeleti üzerine kuruldu.</w:t>
       </w:r>
     </w:p>
     <w:p>
@@ -2174,6 +2237,46 @@
       </w:r>
       <w:r>
         <w:t xml:space="preserve">etiketi, cevabı belirleyen bilginin 2021–2025 sorularında ölçülüp ölçülmediğine bakılarak yeniden kontrol edildi. 6 sorunun etiketi değişti (2’si beklenen → çıkmış, 4’ü çıkmış → beklenen), 6 sorunun çıkmış soru referansı düzeltildi. Metin benzerliği taramasında testler kendi aralarında, önceki 3 denemeyle ve 500 çıkmış soruyla kopya ya da birbirine yakın soru çıkmadı.</w:t>
+      </w:r>
+    </w:p>
+    <w:p>
+      <w:pPr>
+        <w:numPr>
+          <w:ilvl w:val="0"/>
+          <w:numId w:val="1004"/>
+        </w:numPr>
+        <w:pStyle w:val="Compact"/>
+      </w:pPr>
+      <w:r>
+        <w:rPr>
+          <w:bCs/>
+          <w:b/>
+        </w:rPr>
+        <w:t xml:space="preserve">Hesaplamanın ayrı konu sayılması:</w:t>
+      </w:r>
+      <w:r>
+        <w:t xml:space="preserve"> </w:t>
+      </w:r>
+      <w:r>
+        <w:t xml:space="preserve">Analizdeki alan ayrımına uygun olarak 59 hesap sorusu ayrı</w:t>
+      </w:r>
+      <w:r>
+        <w:t xml:space="preserve"> </w:t>
+      </w:r>
+      <w:r>
+        <w:t xml:space="preserve">“</w:t>
+      </w:r>
+      <w:r>
+        <w:t xml:space="preserve">Hesaplama</w:t>
+      </w:r>
+      <w:r>
+        <w:t xml:space="preserve">”</w:t>
+      </w:r>
+      <w:r>
+        <w:t xml:space="preserve"> </w:t>
+      </w:r>
+      <w:r>
+        <w:t xml:space="preserve">konusuna sayılınca (Gümrük Kıymeti 47 → 15, KDV 13 → 4 vb.) test dağılımı yeniden hesaplandı. Hesap sorusu 14’ten 19’a çıktı; fazla kalan konulardan 9 soru çıkarıldı, yerine 5 hesap ve 4 sözel soru yazıldı (bir soru Test 3’ten Test 2’ye taşındı). Yeni soruların hepsi bağımsız doğrulamadan (4 sözelde 3, 5 hesapta 5 düzeltme; 1 hesap sorusu yeniden yazıldı) ve kendi testleriyle çapraz kontrolden geçti. Konu başına soru sayıları yeni sınıflamanın hedefleriyle birebir aynı.</w:t>
       </w:r>
     </w:p>
     <w:bookmarkEnd w:id="25"/>

</xml_diff>

<commit_message>
Karma Test 4–6 (ikinci set): 150 yeni soru, Word/PDF, veri ve OKU-BENI güncellemesi
Test 1–3 ve üç denemede ölçülen hükümler tekrar edilmeden aynı dağılımla
(30 çok + 13 orta + 6 az + 1 hiç; Hesaplama ayrı konu, 7/6/6 hesap) yazıldı.
Küme doğrulaması, test bazında çapraz kontrol ve yeniden yazılan sorular için
ayrı bağımsız kontrol kayıtları uretim-kayitlari/ikinci-set altında.

Co-Authored-By: Claude Opus 5.5 <noreply@anthropic.com>
Claude-Session: https://claude.ai/code/session_01GgDEz86kKogUAFjPuHAFPg
</commit_message>
<xml_diff>
--- a/02-KONU-SINIFLARI-HAP-VE-KARMA-TESTLER/00-OKU-BENI.docx
+++ b/02-KONU-SINIFLARI-HAP-VE-KARMA-TESTLER/00-OKU-BENI.docx
@@ -2,7 +2,7 @@
 <file path=word/document.xml><?xml version="1.0" encoding="utf-8"?>
 <w:document xmlns:w="http://schemas.openxmlformats.org/wordprocessingml/2006/main" xmlns:m="http://schemas.openxmlformats.org/officeDocument/2006/math" xmlns:r="http://schemas.openxmlformats.org/officeDocument/2006/relationships" xmlns:o="urn:schemas-microsoft-com:office:office" xmlns:v="urn:schemas-microsoft-com:vml" xmlns:w10="urn:schemas-microsoft-com:office:word" xmlns:a="http://schemas.openxmlformats.org/drawingml/2006/main" xmlns:pic="http://schemas.openxmlformats.org/drawingml/2006/picture" xmlns:wp="http://schemas.openxmlformats.org/drawingml/2006/wordprocessingDrawing">
   <w:body>
-    <w:bookmarkStart w:id="28" w:name="Xb913bd540543b57878b1360f64e9638af9460a6"/>
+    <w:bookmarkStart w:id="29" w:name="Xb913bd540543b57878b1360f64e9638af9460a6"/>
     <w:p>
       <w:pPr>
         <w:pStyle w:val="Heading1"/>
@@ -550,6 +550,81 @@
               <w:rPr>
                 <w:rStyle w:val="VerbatimChar"/>
               </w:rPr>
+              <w:t xml:space="preserve">KARMA-TEST-4…</w:t>
+            </w:r>
+            <w:r>
+              <w:t xml:space="preserve">,</w:t>
+            </w:r>
+            <w:r>
+              <w:t xml:space="preserve"> </w:t>
+            </w:r>
+            <w:r>
+              <w:rPr>
+                <w:rStyle w:val="VerbatimChar"/>
+              </w:rPr>
+              <w:t xml:space="preserve">KARMA-TEST-5…</w:t>
+            </w:r>
+            <w:r>
+              <w:t xml:space="preserve">,</w:t>
+            </w:r>
+            <w:r>
+              <w:t xml:space="preserve"> </w:t>
+            </w:r>
+            <w:r>
+              <w:rPr>
+                <w:rStyle w:val="VerbatimChar"/>
+              </w:rPr>
+              <w:t xml:space="preserve">KARMA-TEST-6…</w:t>
+            </w:r>
+          </w:p>
+        </w:tc>
+        <w:tc>
+          <w:tcPr/>
+          <w:p>
+            <w:pPr>
+              <w:pStyle w:val="Compact"/>
+              <w:jc w:val="left"/>
+            </w:pPr>
+            <w:r>
+              <w:rPr>
+                <w:bCs/>
+                <w:b/>
+              </w:rPr>
+              <w:t xml:space="preserve">İkinci set</w:t>
+            </w:r>
+            <w:r>
+              <w:t xml:space="preserve">, aynı düzende ve aynı dağılım kurallarıyla; Test 1–3’te ve üç denemede ölçülen hiçbir hükmü tekrar etmez (aşağıda</w:t>
+            </w:r>
+            <w:r>
+              <w:t xml:space="preserve"> </w:t>
+            </w:r>
+            <w:r>
+              <w:t xml:space="preserve">“</w:t>
+            </w:r>
+            <w:r>
+              <w:t xml:space="preserve">İkinci set</w:t>
+            </w:r>
+            <w:r>
+              <w:t xml:space="preserve">”</w:t>
+            </w:r>
+            <w:r>
+              <w:t xml:space="preserve">)</w:t>
+            </w:r>
+          </w:p>
+        </w:tc>
+      </w:tr>
+      <w:tr>
+        <w:tc>
+          <w:tcPr/>
+          <w:p>
+            <w:pPr>
+              <w:pStyle w:val="Compact"/>
+              <w:jc w:val="left"/>
+            </w:pPr>
+            <w:r>
+              <w:rPr>
+                <w:rStyle w:val="VerbatimChar"/>
+              </w:rPr>
               <w:t xml:space="preserve">veri/</w:t>
             </w:r>
           </w:p>
@@ -640,7 +715,7 @@
               <w:rPr>
                 <w:rStyle w:val="VerbatimChar"/>
               </w:rPr>
-              <w:t xml:space="preserve">karma-test1..3.json</w:t>
+              <w:t xml:space="preserve">karma-test1..6.json</w:t>
             </w:r>
           </w:p>
         </w:tc>
@@ -669,7 +744,22 @@
               <w:jc w:val="left"/>
             </w:pPr>
             <w:r>
-              <w:t xml:space="preserve">Ajan talimatları, konu kümeleri, test slotları, küme doğrulama raporları, çapraz kontrol yamaları ve betikler (dokümanların nasıl üretildiğinin kaydı)</w:t>
+              <w:t xml:space="preserve">Ajan talimatları, konu kümeleri, test slotları, küme doğrulama raporları, çapraz kontrol yamaları ve betikler (dokümanların nasıl üretildiğinin kaydı); ikinci setinkiler</w:t>
+            </w:r>
+            <w:r>
+              <w:t xml:space="preserve"> </w:t>
+            </w:r>
+            <w:r>
+              <w:rPr>
+                <w:rStyle w:val="VerbatimChar"/>
+              </w:rPr>
+              <w:t xml:space="preserve">uretim-kayitlari/ikinci-set/</w:t>
+            </w:r>
+            <w:r>
+              <w:t xml:space="preserve"> </w:t>
+            </w:r>
+            <w:r>
+              <w:t xml:space="preserve">altında</w:t>
             </w:r>
           </w:p>
         </w:tc>
@@ -1339,7 +1429,7 @@
       </w:r>
     </w:p>
     <w:bookmarkEnd w:id="22"/>
-    <w:bookmarkStart w:id="24" w:name="karma-testler"/>
+    <w:bookmarkStart w:id="25" w:name="karma-testler"/>
     <w:p>
       <w:pPr>
         <w:pStyle w:val="Heading2"/>
@@ -1901,15 +1991,428 @@
         <w:t xml:space="preserve">. Yanlışlarını konu ve sınıfa göre izlemek için.</w:t>
       </w:r>
     </w:p>
-    <w:bookmarkStart w:id="23" w:name="önerilen-kullanım"/>
+    <w:bookmarkStart w:id="23" w:name="ikinci-set-test-46"/>
     <w:p>
       <w:pPr>
         <w:pStyle w:val="Heading3"/>
       </w:pPr>
       <w:r>
-        <w:t xml:space="preserve">Önerilen kullanım</w:t>
-      </w:r>
-    </w:p>
+        <w:t xml:space="preserve">İkinci set: Test 4–6</w:t>
+      </w:r>
+    </w:p>
+    <w:p>
+      <w:pPr>
+        <w:pStyle w:val="FirstParagraph"/>
+      </w:pPr>
+      <w:r>
+        <w:t xml:space="preserve">Aynı kurallar:</w:t>
+      </w:r>
+      <w:r>
+        <w:t xml:space="preserve"> </w:t>
+      </w:r>
+      <w:r>
+        <w:rPr>
+          <w:bCs/>
+          <w:b/>
+        </w:rPr>
+        <w:t xml:space="preserve">50 soru · 75 dakika</w:t>
+      </w:r>
+      <w:r>
+        <w:t xml:space="preserve">,</w:t>
+      </w:r>
+      <w:r>
+        <w:t xml:space="preserve"> </w:t>
+      </w:r>
+      <w:r>
+        <w:rPr>
+          <w:bCs/>
+          <w:b/>
+        </w:rPr>
+        <w:t xml:space="preserve">30 çok çıkan + 13 orta + 6 az + 1 hiç çıkmayan</w:t>
+      </w:r>
+      <w:r>
+        <w:t xml:space="preserve"> </w:t>
+      </w:r>
+      <w:r>
+        <w:t xml:space="preserve">konu sorusu, Hesaplama ayrı konu. Fark: cevabı belirleyen bilgi olarak</w:t>
+      </w:r>
+      <w:r>
+        <w:t xml:space="preserve"> </w:t>
+      </w:r>
+      <w:r>
+        <w:rPr>
+          <w:bCs/>
+          <w:b/>
+        </w:rPr>
+        <w:t xml:space="preserve">Karma Test 1–3’te ya da önceki üç deneme sınavında ölçülen hiçbir hüküm tekrar edilmedi</w:t>
+      </w:r>
+      <w:r>
+        <w:t xml:space="preserve">; çeldiricilerde de aynı hüküm aynı kurguyla kullanılmadı. Bu yüzden ağırlık hiç sorulmamış hükümlerdedir; çıkmış bilgi alanı kullanılan sorularda ilk setin kullanmadığı çıkmış sorular seçildi. Hesap sorusu toplam 19: kıymet 10, KDV matrahı 3, ceza, uzlaşma, TPS gözetimi, ÖTV (sigara), İGV tavanı ve geçici ithalat faizi birer.</w:t>
+      </w:r>
+    </w:p>
+    <w:tbl>
+      <w:tblPr>
+        <w:tblStyle w:val="Table"/>
+        <w:tblW w:type="pct" w:w="5000"/>
+        <w:tblLook w:firstRow="1" w:lastRow="0" w:firstColumn="0" w:lastColumn="0" w:noHBand="0" w:noVBand="0" w:val="0020"/>
+        <w:jc w:val="start"/>
+      </w:tblPr>
+      <w:tblGrid>
+        <w:gridCol w:w="1452"/>
+        <w:gridCol w:w="2112"/>
+        <w:gridCol w:w="2244"/>
+        <w:gridCol w:w="2112"/>
+      </w:tblGrid>
+      <w:tr>
+        <w:trPr>
+          <w:tblHeader w:val="true"/>
+        </w:trPr>
+        <w:tc>
+          <w:tcPr/>
+          <w:p>
+            <w:pPr>
+              <w:pStyle w:val="Compact"/>
+            </w:pPr>
+          </w:p>
+        </w:tc>
+        <w:tc>
+          <w:tcPr/>
+          <w:p>
+            <w:pPr>
+              <w:pStyle w:val="Compact"/>
+              <w:jc w:val="left"/>
+            </w:pPr>
+            <w:r>
+              <w:t xml:space="preserve">Test 4</w:t>
+            </w:r>
+          </w:p>
+        </w:tc>
+        <w:tc>
+          <w:tcPr/>
+          <w:p>
+            <w:pPr>
+              <w:pStyle w:val="Compact"/>
+              <w:jc w:val="left"/>
+            </w:pPr>
+            <w:r>
+              <w:t xml:space="preserve">Test 5</w:t>
+            </w:r>
+          </w:p>
+        </w:tc>
+        <w:tc>
+          <w:tcPr/>
+          <w:p>
+            <w:pPr>
+              <w:pStyle w:val="Compact"/>
+              <w:jc w:val="left"/>
+            </w:pPr>
+            <w:r>
+              <w:t xml:space="preserve">Test 6</w:t>
+            </w:r>
+          </w:p>
+        </w:tc>
+      </w:tr>
+      <w:tr>
+        <w:tc>
+          <w:tcPr/>
+          <w:p>
+            <w:pPr>
+              <w:pStyle w:val="Compact"/>
+              <w:jc w:val="left"/>
+            </w:pPr>
+            <w:r>
+              <w:t xml:space="preserve">Blok düzeni</w:t>
+            </w:r>
+          </w:p>
+        </w:tc>
+        <w:tc>
+          <w:tcPr/>
+          <w:p>
+            <w:pPr>
+              <w:pStyle w:val="Compact"/>
+              <w:jc w:val="left"/>
+            </w:pPr>
+            <w:r>
+              <w:t xml:space="preserve">1–23 GM · 24–36 Sair · 37–43 Tarife · 44–50 Hesap</w:t>
+            </w:r>
+          </w:p>
+        </w:tc>
+        <w:tc>
+          <w:tcPr/>
+          <w:p>
+            <w:pPr>
+              <w:pStyle w:val="Compact"/>
+              <w:jc w:val="left"/>
+            </w:pPr>
+            <w:r>
+              <w:t xml:space="preserve">1–23 GM · 24–38 Sair · 39–44 Tarife · 45–50 Hesap</w:t>
+            </w:r>
+          </w:p>
+        </w:tc>
+        <w:tc>
+          <w:tcPr/>
+          <w:p>
+            <w:pPr>
+              <w:pStyle w:val="Compact"/>
+              <w:jc w:val="left"/>
+            </w:pPr>
+            <w:r>
+              <w:t xml:space="preserve">1–20 GM · 21–35 Sair · 36–44 Tarife · 45–50 Hesap</w:t>
+            </w:r>
+          </w:p>
+        </w:tc>
+      </w:tr>
+      <w:tr>
+        <w:tc>
+          <w:tcPr/>
+          <w:p>
+            <w:pPr>
+              <w:pStyle w:val="Compact"/>
+              <w:jc w:val="left"/>
+            </w:pPr>
+            <w:r>
+              <w:t xml:space="preserve">Hesap sorusu</w:t>
+            </w:r>
+          </w:p>
+        </w:tc>
+        <w:tc>
+          <w:tcPr/>
+          <w:p>
+            <w:pPr>
+              <w:pStyle w:val="Compact"/>
+              <w:jc w:val="left"/>
+            </w:pPr>
+            <w:r>
+              <w:t xml:space="preserve">7</w:t>
+            </w:r>
+          </w:p>
+        </w:tc>
+        <w:tc>
+          <w:tcPr/>
+          <w:p>
+            <w:pPr>
+              <w:pStyle w:val="Compact"/>
+              <w:jc w:val="left"/>
+            </w:pPr>
+            <w:r>
+              <w:t xml:space="preserve">6 (47–48 ortak veriye bağlı kıymet → KDV matrahı)</w:t>
+            </w:r>
+          </w:p>
+        </w:tc>
+        <w:tc>
+          <w:tcPr/>
+          <w:p>
+            <w:pPr>
+              <w:pStyle w:val="Compact"/>
+              <w:jc w:val="left"/>
+            </w:pPr>
+            <w:r>
+              <w:t xml:space="preserve">6</w:t>
+            </w:r>
+          </w:p>
+        </w:tc>
+      </w:tr>
+      <w:tr>
+        <w:tc>
+          <w:tcPr/>
+          <w:p>
+            <w:pPr>
+              <w:pStyle w:val="Compact"/>
+              <w:jc w:val="left"/>
+            </w:pPr>
+            <w:r>
+              <w:t xml:space="preserve">Hiç çıkmayan konu sorusu</w:t>
+            </w:r>
+          </w:p>
+        </w:tc>
+        <w:tc>
+          <w:tcPr/>
+          <w:p>
+            <w:pPr>
+              <w:pStyle w:val="Compact"/>
+              <w:jc w:val="left"/>
+            </w:pPr>
+            <w:r>
+              <w:t xml:space="preserve">Denizyolu Transiti ve İzinli Gönderici</w:t>
+            </w:r>
+          </w:p>
+        </w:tc>
+        <w:tc>
+          <w:tcPr/>
+          <w:p>
+            <w:pPr>
+              <w:pStyle w:val="Compact"/>
+              <w:jc w:val="left"/>
+            </w:pPr>
+            <w:r>
+              <w:t xml:space="preserve">E-İhracat Destekleri ve Dış Ticaret Sermaye Şirketi</w:t>
+            </w:r>
+          </w:p>
+        </w:tc>
+        <w:tc>
+          <w:tcPr/>
+          <w:p>
+            <w:pPr>
+              <w:pStyle w:val="Compact"/>
+              <w:jc w:val="left"/>
+            </w:pPr>
+            <w:r>
+              <w:t xml:space="preserve">Taşıtların Giriş-Çıkışı</w:t>
+            </w:r>
+          </w:p>
+        </w:tc>
+      </w:tr>
+      <w:tr>
+        <w:tc>
+          <w:tcPr/>
+          <w:p>
+            <w:pPr>
+              <w:pStyle w:val="Compact"/>
+              <w:jc w:val="left"/>
+            </w:pPr>
+            <w:r>
+              <w:t xml:space="preserve">Çıkmış bilgi alanı / beklenen hüküm</w:t>
+            </w:r>
+          </w:p>
+        </w:tc>
+        <w:tc>
+          <w:tcPr/>
+          <w:p>
+            <w:pPr>
+              <w:pStyle w:val="Compact"/>
+              <w:jc w:val="left"/>
+            </w:pPr>
+            <w:r>
+              <w:t xml:space="preserve">5 / 45</w:t>
+            </w:r>
+          </w:p>
+        </w:tc>
+        <w:tc>
+          <w:tcPr/>
+          <w:p>
+            <w:pPr>
+              <w:pStyle w:val="Compact"/>
+              <w:jc w:val="left"/>
+            </w:pPr>
+            <w:r>
+              <w:t xml:space="preserve">9 / 41</w:t>
+            </w:r>
+          </w:p>
+        </w:tc>
+        <w:tc>
+          <w:tcPr/>
+          <w:p>
+            <w:pPr>
+              <w:pStyle w:val="Compact"/>
+              <w:jc w:val="left"/>
+            </w:pPr>
+            <w:r>
+              <w:t xml:space="preserve">8 / 42</w:t>
+            </w:r>
+          </w:p>
+        </w:tc>
+      </w:tr>
+      <w:tr>
+        <w:tc>
+          <w:tcPr/>
+          <w:p>
+            <w:pPr>
+              <w:pStyle w:val="Compact"/>
+              <w:jc w:val="left"/>
+            </w:pPr>
+            <w:r>
+              <w:t xml:space="preserve">Zorluk (kolay · orta · zor)</w:t>
+            </w:r>
+          </w:p>
+        </w:tc>
+        <w:tc>
+          <w:tcPr/>
+          <w:p>
+            <w:pPr>
+              <w:pStyle w:val="Compact"/>
+              <w:jc w:val="left"/>
+            </w:pPr>
+            <w:r>
+              <w:t xml:space="preserve">12 · 25 · 13</w:t>
+            </w:r>
+          </w:p>
+        </w:tc>
+        <w:tc>
+          <w:tcPr/>
+          <w:p>
+            <w:pPr>
+              <w:pStyle w:val="Compact"/>
+              <w:jc w:val="left"/>
+            </w:pPr>
+            <w:r>
+              <w:t xml:space="preserve">10 · 27 · 13</w:t>
+            </w:r>
+          </w:p>
+        </w:tc>
+        <w:tc>
+          <w:tcPr/>
+          <w:p>
+            <w:pPr>
+              <w:pStyle w:val="Compact"/>
+              <w:jc w:val="left"/>
+            </w:pPr>
+            <w:r>
+              <w:t xml:space="preserve">13 · 25 · 12</w:t>
+            </w:r>
+          </w:p>
+        </w:tc>
+      </w:tr>
+      <w:tr>
+        <w:tc>
+          <w:tcPr/>
+          <w:p>
+            <w:pPr>
+              <w:pStyle w:val="Compact"/>
+              <w:jc w:val="left"/>
+            </w:pPr>
+            <w:r>
+              <w:t xml:space="preserve">Konu sayısı</w:t>
+            </w:r>
+          </w:p>
+        </w:tc>
+        <w:tc>
+          <w:tcPr/>
+          <w:p>
+            <w:pPr>
+              <w:pStyle w:val="Compact"/>
+              <w:jc w:val="left"/>
+            </w:pPr>
+            <w:r>
+              <w:t xml:space="preserve">36</w:t>
+            </w:r>
+          </w:p>
+        </w:tc>
+        <w:tc>
+          <w:tcPr/>
+          <w:p>
+            <w:pPr>
+              <w:pStyle w:val="Compact"/>
+              <w:jc w:val="left"/>
+            </w:pPr>
+            <w:r>
+              <w:t xml:space="preserve">36</w:t>
+            </w:r>
+          </w:p>
+        </w:tc>
+        <w:tc>
+          <w:tcPr/>
+          <w:p>
+            <w:pPr>
+              <w:pStyle w:val="Compact"/>
+              <w:jc w:val="left"/>
+            </w:pPr>
+            <w:r>
+              <w:t xml:space="preserve">36</w:t>
+            </w:r>
+          </w:p>
+        </w:tc>
+      </w:tr>
+    </w:tbl>
     <w:p>
       <w:pPr>
         <w:numPr>
@@ -1919,55 +2422,7 @@
         <w:pStyle w:val="Compact"/>
       </w:pPr>
       <w:r>
-        <w:t xml:space="preserve">Önce 01 numaralı dokümanda</w:t>
-      </w:r>
-      <w:r>
-        <w:t xml:space="preserve"> </w:t>
-      </w:r>
-      <w:r>
-        <w:rPr>
-          <w:bCs/>
-          <w:b/>
-        </w:rPr>
-        <w:t xml:space="preserve">çok çıkan</w:t>
-      </w:r>
-      <w:r>
-        <w:t xml:space="preserve"> </w:t>
-      </w:r>
-      <w:r>
-        <w:t xml:space="preserve">konuların haplarını, sonra</w:t>
-      </w:r>
-      <w:r>
-        <w:t xml:space="preserve"> </w:t>
-      </w:r>
-      <w:r>
-        <w:rPr>
-          <w:bCs/>
-          <w:b/>
-        </w:rPr>
-        <w:t xml:space="preserve">orta</w:t>
-      </w:r>
-      <w:r>
-        <w:t xml:space="preserve"> </w:t>
-      </w:r>
-      <w:r>
-        <w:t xml:space="preserve">ve</w:t>
-      </w:r>
-      <w:r>
-        <w:t xml:space="preserve"> </w:t>
-      </w:r>
-      <w:r>
-        <w:rPr>
-          <w:bCs/>
-          <w:b/>
-        </w:rPr>
-        <w:t xml:space="preserve">az</w:t>
-      </w:r>
-      <w:r>
-        <w:t xml:space="preserve"> </w:t>
-      </w:r>
-      <w:r>
-        <w:t xml:space="preserve">çıkanları çalış. ★ işaretli haplar birden fazla yılda sorulmuş bilgilerdir.</w:t>
+        <w:t xml:space="preserve">Her harf 10 kez doğru cevap; aynı harf en fazla 3 kez üst üste.</w:t>
       </w:r>
     </w:p>
     <w:p>
@@ -1979,58 +2434,17 @@
         <w:pStyle w:val="Compact"/>
       </w:pPr>
       <w:r>
-        <w:t xml:space="preserve">Her konuda 02 (beklenen) haplarına geç;</w:t>
-      </w:r>
-      <w:r>
-        <w:t xml:space="preserve"> </w:t>
-      </w:r>
-      <w:r>
-        <w:rPr>
-          <w:bCs/>
-          <w:b/>
-        </w:rPr>
-        <w:t xml:space="preserve">[Yeni]</w:t>
-      </w:r>
-      <w:r>
-        <w:t xml:space="preserve"> </w:t>
-      </w:r>
-      <w:r>
-        <w:t xml:space="preserve">etiketlileri ayrıca işaretle.</w:t>
-      </w:r>
-    </w:p>
-    <w:p>
-      <w:pPr>
-        <w:numPr>
-          <w:ilvl w:val="0"/>
-          <w:numId w:val="1003"/>
-        </w:numPr>
-        <w:pStyle w:val="Compact"/>
-      </w:pPr>
-      <w:r>
-        <w:t xml:space="preserve">Test kitapçığını yazdır, 75 dakikada çöz; tam test dosyasının Cevap Anahtarı ile puanla, Bölüm B’den gerekçeleri oku.</w:t>
-      </w:r>
-    </w:p>
-    <w:p>
-      <w:pPr>
-        <w:numPr>
-          <w:ilvl w:val="0"/>
-          <w:numId w:val="1003"/>
-        </w:numPr>
-        <w:pStyle w:val="Compact"/>
-      </w:pPr>
-      <w:r>
-        <w:t xml:space="preserve">Yanlış yaptığın sorunun konusunu 03 numaralı soru–cevap dokümanında bulup alt konuları tara.</w:t>
+        <w:t xml:space="preserve">Metin benzerliği taramasında ikinci setin 150 sorusu ilk setle, üç denemeyle, 500 çıkmış soruyla ve kendi aralarında karşılaştırıldı; kopya ya da aynı hükmü aynı kurguyla ölçen soru kalmadı.</w:t>
       </w:r>
     </w:p>
     <w:bookmarkEnd w:id="23"/>
-    <w:bookmarkEnd w:id="24"/>
-    <w:bookmarkStart w:id="25" w:name="nasıl-hazırlandı"/>
-    <w:p>
-      <w:pPr>
-        <w:pStyle w:val="Heading2"/>
-      </w:pPr>
-      <w:r>
-        <w:t xml:space="preserve">Nasıl hazırlandı?</w:t>
+    <w:bookmarkStart w:id="24" w:name="önerilen-kullanım"/>
+    <w:p>
+      <w:pPr>
+        <w:pStyle w:val="Heading3"/>
+      </w:pPr>
+      <w:r>
+        <w:t xml:space="preserve">Önerilen kullanım</w:t>
       </w:r>
     </w:p>
     <w:p>
@@ -2042,35 +2456,55 @@
         <w:pStyle w:val="Compact"/>
       </w:pPr>
       <w:r>
-        <w:rPr>
-          <w:bCs/>
-          <w:b/>
-        </w:rPr>
-        <w:t xml:space="preserve">Konu eşleme:</w:t>
-      </w:r>
-      <w:r>
-        <w:t xml:space="preserve"> </w:t>
-      </w:r>
-      <w:r>
-        <w:t xml:space="preserve">500 sorunun her biri 76 ince içerik konusundan birine atandı; analizdeki alan ayrımına uygun olarak 59 hesap sorusu ayrıca</w:t>
-      </w:r>
-      <w:r>
-        <w:t xml:space="preserve"> </w:t>
-      </w:r>
-      <w:r>
-        <w:t xml:space="preserve">“</w:t>
-      </w:r>
-      <w:r>
-        <w:t xml:space="preserve">Hesaplama</w:t>
-      </w:r>
-      <w:r>
-        <w:t xml:space="preserve">”</w:t>
-      </w:r>
-      <w:r>
-        <w:t xml:space="preserve"> </w:t>
-      </w:r>
-      <w:r>
-        <w:t xml:space="preserve">konusunda sayıldı (toplam 77 konu). Sorular, mevzuat dosyaları ve resmî anahtarlar konu dosyalarında toplandı.</w:t>
+        <w:t xml:space="preserve">Önce 01 numaralı dokümanda</w:t>
+      </w:r>
+      <w:r>
+        <w:t xml:space="preserve"> </w:t>
+      </w:r>
+      <w:r>
+        <w:rPr>
+          <w:bCs/>
+          <w:b/>
+        </w:rPr>
+        <w:t xml:space="preserve">çok çıkan</w:t>
+      </w:r>
+      <w:r>
+        <w:t xml:space="preserve"> </w:t>
+      </w:r>
+      <w:r>
+        <w:t xml:space="preserve">konuların haplarını, sonra</w:t>
+      </w:r>
+      <w:r>
+        <w:t xml:space="preserve"> </w:t>
+      </w:r>
+      <w:r>
+        <w:rPr>
+          <w:bCs/>
+          <w:b/>
+        </w:rPr>
+        <w:t xml:space="preserve">orta</w:t>
+      </w:r>
+      <w:r>
+        <w:t xml:space="preserve"> </w:t>
+      </w:r>
+      <w:r>
+        <w:t xml:space="preserve">ve</w:t>
+      </w:r>
+      <w:r>
+        <w:t xml:space="preserve"> </w:t>
+      </w:r>
+      <w:r>
+        <w:rPr>
+          <w:bCs/>
+          <w:b/>
+        </w:rPr>
+        <w:t xml:space="preserve">az</w:t>
+      </w:r>
+      <w:r>
+        <w:t xml:space="preserve"> </w:t>
+      </w:r>
+      <w:r>
+        <w:t xml:space="preserve">çıkanları çalış. ★ işaretli haplar birden fazla yılda sorulmuş bilgilerdir.</w:t>
       </w:r>
     </w:p>
     <w:p>
@@ -2082,17 +2516,23 @@
         <w:pStyle w:val="Compact"/>
       </w:pPr>
       <w:r>
-        <w:rPr>
-          <w:bCs/>
-          <w:b/>
-        </w:rPr>
-        <w:t xml:space="preserve">Çıkan sorulardan hap:</w:t>
-      </w:r>
-      <w:r>
-        <w:t xml:space="preserve"> </w:t>
-      </w:r>
-      <w:r>
-        <w:t xml:space="preserve">76 içerik konusu 14 kümeye ayrıldı. Her kümede bütün çıkmış sorular hap satırlarına dönüştürüldü; hesap sorularının hapları Hesaplama bölümüne taşındı (hem hesap hem sözel soruya dayanan 6 hap iki yerde). Bir betik, her sorunun kendi konusunun haplarında geçtiğini denetledi (500/500).</w:t>
+        <w:t xml:space="preserve">Her konuda 02 (beklenen) haplarına geç;</w:t>
+      </w:r>
+      <w:r>
+        <w:t xml:space="preserve"> </w:t>
+      </w:r>
+      <w:r>
+        <w:rPr>
+          <w:bCs/>
+          <w:b/>
+        </w:rPr>
+        <w:t xml:space="preserve">[Yeni]</w:t>
+      </w:r>
+      <w:r>
+        <w:t xml:space="preserve"> </w:t>
+      </w:r>
+      <w:r>
+        <w:t xml:space="preserve">etiketlileri ayrıca işaretle.</w:t>
       </w:r>
     </w:p>
     <w:p>
@@ -2104,17 +2544,7 @@
         <w:pStyle w:val="Compact"/>
       </w:pPr>
       <w:r>
-        <w:rPr>
-          <w:bCs/>
-          <w:b/>
-        </w:rPr>
-        <w:t xml:space="preserve">Beklenen ve sorulmayan:</w:t>
-      </w:r>
-      <w:r>
-        <w:t xml:space="preserve"> </w:t>
-      </w:r>
-      <w:r>
-        <w:t xml:space="preserve">Her konunun alt konuları kaynak metinle karşılaştırılıp SORULDU / KISMEN / SORULMADI diye işaretlendi. Soru–cevapların ve beklenen hapların her biri kaynak metinden birebir bir kesitle (kanıt) yazıldı; bir betik bu kesitleri kaynak dosyalarda aradı, bulunamayanlar elendi. Kümeler arası tekrarlar ve güncelliğini yitirmiş iki madde (Revize PEM 27.03.2026 yazısıyla) çıkarıldı.</w:t>
+        <w:t xml:space="preserve">Test kitapçığını yazdır, 75 dakikada çöz; tam test dosyasının Cevap Anahtarı ile puanla, Bölüm B’den gerekçeleri oku.</w:t>
       </w:r>
     </w:p>
     <w:p>
@@ -2126,191 +2556,18 @@
         <w:pStyle w:val="Compact"/>
       </w:pPr>
       <w:r>
-        <w:rPr>
-          <w:bCs/>
-          <w:b/>
-        </w:rPr>
-        <w:t xml:space="preserve">Karma testler:</w:t>
-      </w:r>
-      <w:r>
-        <w:t xml:space="preserve"> </w:t>
-      </w:r>
-      <w:r>
-        <w:t xml:space="preserve">150 soru konu slotlarına bölündü ve 14 kümede yazıldı (8. adımdaki güncellemeyle 16 küme). Hesap soruları çıkmış hesap sorularının iskeleti üzerine kuruldu.</w:t>
-      </w:r>
-    </w:p>
-    <w:p>
-      <w:pPr>
-        <w:numPr>
-          <w:ilvl w:val="0"/>
-          <w:numId w:val="1004"/>
-        </w:numPr>
-        <w:pStyle w:val="Compact"/>
-      </w:pPr>
-      <w:r>
-        <w:rPr>
-          <w:bCs/>
-          <w:b/>
-        </w:rPr>
-        <w:t xml:space="preserve">Bağımsız doğrulama:</w:t>
-      </w:r>
-      <w:r>
-        <w:t xml:space="preserve"> </w:t>
-      </w:r>
-      <w:r>
-        <w:t xml:space="preserve">Her küme, soruyu cevaba bakmadan çözen ikinci bir uzman tarafından kaynakla karşılaştırıldı. 150 sorunun</w:t>
-      </w:r>
-      <w:r>
-        <w:t xml:space="preserve"> </w:t>
-      </w:r>
-      <w:r>
-        <w:rPr>
-          <w:bCs/>
-          <w:b/>
-        </w:rPr>
-        <w:t xml:space="preserve">133’ü değişmeden geçti, 17’si düzeltildi</w:t>
-      </w:r>
-      <w:r>
-        <w:t xml:space="preserve"> </w:t>
-      </w:r>
-      <w:r>
-        <w:t xml:space="preserve">(iki hatanın birlikte doğru cevabı verdiği hesaplar, belirsiz veri, önceki denemeyle tekrar). Hiçbir cevap harfi değişmedi. Hesap sorularının bütün şıkları ve 0–2 hatalı bütün yolları betikle yeniden hesaplandı.</w:t>
-      </w:r>
-    </w:p>
-    <w:p>
-      <w:pPr>
-        <w:numPr>
-          <w:ilvl w:val="0"/>
-          <w:numId w:val="1004"/>
-        </w:numPr>
-        <w:pStyle w:val="Compact"/>
-      </w:pPr>
-      <w:r>
-        <w:rPr>
-          <w:bCs/>
-          <w:b/>
-        </w:rPr>
-        <w:t xml:space="preserve">Test bazında çapraz kontrol:</w:t>
-      </w:r>
-      <w:r>
-        <w:t xml:space="preserve"> </w:t>
-      </w:r>
-      <w:r>
-        <w:t xml:space="preserve">Her test 50 sorusuyla baştan sona, anahtara bakmadan çözüldü. Anahtar hatası çıkmadı. 11 soruda test içi tekrar ya da sızıntı, şık konumuna kalmış atıf, vurgusuz olumsuz kök ve güncellik düzeltmesi yapıldı (1 soru yeniden yazıldı).</w:t>
-      </w:r>
-    </w:p>
-    <w:p>
-      <w:pPr>
-        <w:numPr>
-          <w:ilvl w:val="0"/>
-          <w:numId w:val="1004"/>
-        </w:numPr>
-        <w:pStyle w:val="Compact"/>
-      </w:pPr>
-      <w:r>
-        <w:rPr>
-          <w:bCs/>
-          <w:b/>
-        </w:rPr>
-        <w:t xml:space="preserve">Bilgi kaynağı etiketi denetimi:</w:t>
-      </w:r>
-      <w:r>
-        <w:t xml:space="preserve"> </w:t>
-      </w:r>
-      <w:r>
-        <w:t xml:space="preserve">150 sorunun her birinin</w:t>
-      </w:r>
-      <w:r>
-        <w:t xml:space="preserve"> </w:t>
-      </w:r>
-      <w:r>
-        <w:t xml:space="preserve">“</w:t>
-      </w:r>
-      <w:r>
-        <w:t xml:space="preserve">çıkmış bilgi / beklenen hüküm</w:t>
-      </w:r>
-      <w:r>
-        <w:t xml:space="preserve">”</w:t>
-      </w:r>
-      <w:r>
-        <w:t xml:space="preserve"> </w:t>
-      </w:r>
-      <w:r>
-        <w:t xml:space="preserve">etiketi, cevabı belirleyen bilginin 2021–2025 sorularında ölçülüp ölçülmediğine bakılarak yeniden kontrol edildi. 6 sorunun etiketi değişti (2’si beklenen → çıkmış, 4’ü çıkmış → beklenen), 6 sorunun çıkmış soru referansı düzeltildi. Metin benzerliği taramasında testler kendi aralarında, önceki 3 denemeyle ve 500 çıkmış soruyla kopya ya da birbirine yakın soru çıkmadı.</w:t>
-      </w:r>
-    </w:p>
-    <w:p>
-      <w:pPr>
-        <w:numPr>
-          <w:ilvl w:val="0"/>
-          <w:numId w:val="1004"/>
-        </w:numPr>
-        <w:pStyle w:val="Compact"/>
-      </w:pPr>
-      <w:r>
-        <w:rPr>
-          <w:bCs/>
-          <w:b/>
-        </w:rPr>
-        <w:t xml:space="preserve">Hesaplamanın ayrı konu sayılması:</w:t>
-      </w:r>
-      <w:r>
-        <w:t xml:space="preserve"> </w:t>
-      </w:r>
-      <w:r>
-        <w:t xml:space="preserve">Analizdeki alan ayrımına uygun olarak 59 hesap sorusu ayrı</w:t>
-      </w:r>
-      <w:r>
-        <w:t xml:space="preserve"> </w:t>
-      </w:r>
-      <w:r>
-        <w:t xml:space="preserve">“</w:t>
-      </w:r>
-      <w:r>
-        <w:t xml:space="preserve">Hesaplama</w:t>
-      </w:r>
-      <w:r>
-        <w:t xml:space="preserve">”</w:t>
-      </w:r>
-      <w:r>
-        <w:t xml:space="preserve"> </w:t>
-      </w:r>
-      <w:r>
-        <w:t xml:space="preserve">konusuna sayılınca (Gümrük Kıymeti 47 → 15, KDV 13 → 4 vb.) test dağılımı yeniden hesaplandı. Hesap sorusu 14’ten 19’a çıktı; fazla kalan konulardan 9 soru çıkarıldı, yerine 5 hesap ve 4 sözel soru yazıldı (bir soru Test 3’ten Test 2’ye taşındı). Yeni soruların hepsi bağımsız doğrulamadan (4 sözelde 3, 5 hesapta 5 düzeltme; 1 hesap sorusu yeniden yazıldı) ve kendi testleriyle çapraz kontrolden geçti. Konu başına soru sayıları yeni sınıflamanın hedefleriyle birebir aynı.</w:t>
-      </w:r>
-    </w:p>
+        <w:t xml:space="preserve">Yanlış yaptığın sorunun konusunu 03 numaralı soru–cevap dokümanında bulup alt konuları tara.</w:t>
+      </w:r>
+    </w:p>
+    <w:bookmarkEnd w:id="24"/>
     <w:bookmarkEnd w:id="25"/>
-    <w:bookmarkStart w:id="26" w:name="güncellik-uyarıları"/>
+    <w:bookmarkStart w:id="26" w:name="nasıl-hazırlandı"/>
     <w:p>
       <w:pPr>
         <w:pStyle w:val="Heading2"/>
       </w:pPr>
       <w:r>
-        <w:t xml:space="preserve">Güncellik uyarıları</w:t>
-      </w:r>
-    </w:p>
-    <w:p>
-      <w:pPr>
-        <w:pStyle w:val="FirstParagraph"/>
-      </w:pPr>
-      <w:r>
-        <w:t xml:space="preserve">Dokümanlar ve testler depodaki mevzuat metinlerinin son hâline göre hazırlandı. Bazı çıkmış soruların anahtarı bugün farklı çıkar; ilgili haplarda</w:t>
-      </w:r>
-      <w:r>
-        <w:t xml:space="preserve"> </w:t>
-      </w:r>
-      <w:r>
-        <w:rPr>
-          <w:bCs/>
-          <w:b/>
-        </w:rPr>
-        <w:t xml:space="preserve">Not</w:t>
-      </w:r>
-      <w:r>
-        <w:t xml:space="preserve"> </w:t>
-      </w:r>
-      <w:r>
-        <w:t xml:space="preserve">satırında yazılı:</w:t>
+        <w:t xml:space="preserve">Nasıl hazırlandı?</w:t>
       </w:r>
     </w:p>
     <w:p>
@@ -2326,13 +2583,13 @@
           <w:bCs/>
           <w:b/>
         </w:rPr>
-        <w:t xml:space="preserve">GK 241/1:</w:t>
-      </w:r>
-      <w:r>
-        <w:t xml:space="preserve"> </w:t>
-      </w:r>
-      <w:r>
-        <w:t xml:space="preserve">Anayasa Mahkemesinin 26.03.2026 tarihli kararıyla (E.2025/269, K.2026/72) yalnız</w:t>
+        <w:t xml:space="preserve">Konu eşleme:</w:t>
+      </w:r>
+      <w:r>
+        <w:t xml:space="preserve"> </w:t>
+      </w:r>
+      <w:r>
+        <w:t xml:space="preserve">500 sorunun her biri 76 ince içerik konusundan birine atandı; analizdeki alan ayrımına uygun olarak 59 hesap sorusu ayrıca</w:t>
       </w:r>
       <w:r>
         <w:t xml:space="preserve"> </w:t>
@@ -2341,7 +2598,7 @@
         <w:t xml:space="preserve">“</w:t>
       </w:r>
       <w:r>
-        <w:t xml:space="preserve">ikincil düzenlemelere aykırılık</w:t>
+        <w:t xml:space="preserve">Hesaplama</w:t>
       </w:r>
       <w:r>
         <w:t xml:space="preserve">”</w:t>
@@ -2350,7 +2607,7 @@
         <w:t xml:space="preserve"> </w:t>
       </w:r>
       <w:r>
-        <w:t xml:space="preserve">ibaresi iptal edildi; 241/1’deki miktar ve 241/3–6 katları yürürlükte.</w:t>
+        <w:t xml:space="preserve">konusunda sayıldı (toplam 77 konu). Sorular, mevzuat dosyaları ve resmî anahtarlar konu dosyalarında toplandı.</w:t>
       </w:r>
     </w:p>
     <w:p>
@@ -2366,13 +2623,13 @@
           <w:bCs/>
           <w:b/>
         </w:rPr>
-        <w:t xml:space="preserve">GY 94 ve 130/1:</w:t>
-      </w:r>
-      <w:r>
-        <w:t xml:space="preserve"> </w:t>
-      </w:r>
-      <w:r>
-        <w:t xml:space="preserve">Danıştay 12.08.2026 kararıyla iptal.</w:t>
+        <w:t xml:space="preserve">Çıkan sorulardan hap:</w:t>
+      </w:r>
+      <w:r>
+        <w:t xml:space="preserve"> </w:t>
+      </w:r>
+      <w:r>
+        <w:t xml:space="preserve">76 içerik konusu 14 kümeye ayrıldı. Her kümede bütün çıkmış sorular hap satırlarına dönüştürüldü; hesap sorularının hapları Hesaplama bölümüne taşındı (hem hesap hem sözel soruya dayanan 6 hap iki yerde). Bir betik, her sorunun kendi konusunun haplarında geçtiğini denetledi (500/500).</w:t>
       </w:r>
     </w:p>
     <w:p>
@@ -2388,13 +2645,13 @@
           <w:bCs/>
           <w:b/>
         </w:rPr>
-        <w:t xml:space="preserve">KDV Kanunu md. 21/1-ç (24.07.2025):</w:t>
-      </w:r>
-      <w:r>
-        <w:t xml:space="preserve"> </w:t>
-      </w:r>
-      <w:r>
-        <w:t xml:space="preserve">(I) sayılı listede teminata esas ÖTV ithalde KDV matrahına girer; 2025/15’in resmî anahtarı eski kurala dayanır.</w:t>
+        <w:t xml:space="preserve">Beklenen ve sorulmayan:</w:t>
+      </w:r>
+      <w:r>
+        <w:t xml:space="preserve"> </w:t>
+      </w:r>
+      <w:r>
+        <w:t xml:space="preserve">Her konunun alt konuları kaynak metinle karşılaştırılıp SORULDU / KISMEN / SORULMADI diye işaretlendi. Soru–cevapların ve beklenen hapların her biri kaynak metinden birebir bir kesitle (kanıt) yazıldı; bir betik bu kesitleri kaynak dosyalarda aradı, bulunamayanlar elendi. Kümeler arası tekrarlar ve güncelliğini yitirmiş iki madde (Revize PEM 27.03.2026 yazısıyla) çıkarıldı.</w:t>
       </w:r>
     </w:p>
     <w:p>
@@ -2410,29 +2667,13 @@
           <w:bCs/>
           <w:b/>
         </w:rPr>
-        <w:t xml:space="preserve">İthalat Rejimi Kararı md. 62/1</w:t>
-      </w:r>
-      <w:r>
-        <w:t xml:space="preserve"> </w:t>
-      </w:r>
-      <w:r>
-        <w:t xml:space="preserve">(07.01.2026) ve</w:t>
-      </w:r>
-      <w:r>
-        <w:t xml:space="preserve"> </w:t>
-      </w:r>
-      <w:r>
-        <w:rPr>
-          <w:bCs/>
-          <w:b/>
-        </w:rPr>
-        <w:t xml:space="preserve">TIR Tebliği</w:t>
-      </w:r>
-      <w:r>
-        <w:t xml:space="preserve"> </w:t>
-      </w:r>
-      <w:r>
-        <w:t xml:space="preserve">(04.07.2026; md. 20/1’deki sayı sınırı sekiz) değişiklikleri.</w:t>
+        <w:t xml:space="preserve">Karma testler:</w:t>
+      </w:r>
+      <w:r>
+        <w:t xml:space="preserve"> </w:t>
+      </w:r>
+      <w:r>
+        <w:t xml:space="preserve">150 soru konu slotlarına bölündü ve 14 kümede yazıldı (8. adımdaki güncellemeyle 16 küme). Hesap soruları çıkmış hesap sorularının iskeleti üzerine kuruldu.</w:t>
       </w:r>
     </w:p>
     <w:p>
@@ -2448,13 +2689,29 @@
           <w:bCs/>
           <w:b/>
         </w:rPr>
-        <w:t xml:space="preserve">2025/9903 sayılı Karar</w:t>
-      </w:r>
-      <w:r>
-        <w:t xml:space="preserve"> </w:t>
-      </w:r>
-      <w:r>
-        <w:t xml:space="preserve">2012/3305’in yerini aldı (yatırım teşvik).</w:t>
+        <w:t xml:space="preserve">Bağımsız doğrulama:</w:t>
+      </w:r>
+      <w:r>
+        <w:t xml:space="preserve"> </w:t>
+      </w:r>
+      <w:r>
+        <w:t xml:space="preserve">Her küme, soruyu cevaba bakmadan çözen ikinci bir uzman tarafından kaynakla karşılaştırıldı. 150 sorunun</w:t>
+      </w:r>
+      <w:r>
+        <w:t xml:space="preserve"> </w:t>
+      </w:r>
+      <w:r>
+        <w:rPr>
+          <w:bCs/>
+          <w:b/>
+        </w:rPr>
+        <w:t xml:space="preserve">133’ü değişmeden geçti, 17’si düzeltildi</w:t>
+      </w:r>
+      <w:r>
+        <w:t xml:space="preserve"> </w:t>
+      </w:r>
+      <w:r>
+        <w:t xml:space="preserve">(iki hatanın birlikte doğru cevabı verdiği hesaplar, belirsiz veri, önceki denemeyle tekrar). Hiçbir cevap harfi değişmedi. Hesap sorularının bütün şıkları ve 0–2 hatalı bütün yolları betikle yeniden hesaplandı.</w:t>
       </w:r>
     </w:p>
     <w:p>
@@ -2470,13 +2727,13 @@
           <w:bCs/>
           <w:b/>
         </w:rPr>
-        <w:t xml:space="preserve">Revize PEM menşe kuralları</w:t>
-      </w:r>
-      <w:r>
-        <w:t xml:space="preserve"> </w:t>
-      </w:r>
-      <w:r>
-        <w:t xml:space="preserve">(27.03.2026 yazısı): tam kümülasyona ilişkin eski bilgiler çıkarıldı.</w:t>
+        <w:t xml:space="preserve">Test bazında çapraz kontrol:</w:t>
+      </w:r>
+      <w:r>
+        <w:t xml:space="preserve"> </w:t>
+      </w:r>
+      <w:r>
+        <w:t xml:space="preserve">Her test 50 sorusuyla baştan sona, anahtara bakmadan çözüldü. Anahtar hatası çıkmadı. 11 soruda test içi tekrar ya da sızıntı, şık konumuna kalmış atıf, vurgusuz olumsuz kök ve güncellik düzeltmesi yapıldı (1 soru yeniden yazıldı).</w:t>
       </w:r>
     </w:p>
     <w:p>
@@ -2492,13 +2749,31 @@
           <w:bCs/>
           <w:b/>
         </w:rPr>
-        <w:t xml:space="preserve">Resmî anahtarı tartışmalı sorular</w:t>
-      </w:r>
-      <w:r>
-        <w:t xml:space="preserve"> </w:t>
-      </w:r>
-      <w:r>
-        <w:t xml:space="preserve">(2021/89-90, 2022/94, 2023/57, 2023/72-73, 2023/82, 2023/98, 2024/46, 2025/12, 2025/15, 2025/16, 2025/82): haplarda resmî anahtar ve tartışma birlikte verildi; testlerde bu sorular iskelet olarak kullanılmadı.</w:t>
+        <w:t xml:space="preserve">Bilgi kaynağı etiketi denetimi:</w:t>
+      </w:r>
+      <w:r>
+        <w:t xml:space="preserve"> </w:t>
+      </w:r>
+      <w:r>
+        <w:t xml:space="preserve">150 sorunun her birinin</w:t>
+      </w:r>
+      <w:r>
+        <w:t xml:space="preserve"> </w:t>
+      </w:r>
+      <w:r>
+        <w:t xml:space="preserve">“</w:t>
+      </w:r>
+      <w:r>
+        <w:t xml:space="preserve">çıkmış bilgi / beklenen hüküm</w:t>
+      </w:r>
+      <w:r>
+        <w:t xml:space="preserve">”</w:t>
+      </w:r>
+      <w:r>
+        <w:t xml:space="preserve"> </w:t>
+      </w:r>
+      <w:r>
+        <w:t xml:space="preserve">etiketi, cevabı belirleyen bilginin 2021–2025 sorularında ölçülüp ölçülmediğine bakılarak yeniden kontrol edildi. 6 sorunun etiketi değişti (2’si beklenen → çıkmış, 4’ü çıkmış → beklenen), 6 sorunun çıkmış soru referansı düzeltildi. Metin benzerliği taramasında testler kendi aralarında, önceki 3 denemeyle ve 500 çıkmış soruyla kopya ya da birbirine yakın soru çıkmadı.</w:t>
       </w:r>
     </w:p>
     <w:p>
@@ -2514,7 +2789,13 @@
           <w:bCs/>
           <w:b/>
         </w:rPr>
-        <w:t xml:space="preserve">Yalnız resmî anahtara dayanan kurallar:</w:t>
+        <w:t xml:space="preserve">Hesaplamanın ayrı konu sayılması:</w:t>
+      </w:r>
+      <w:r>
+        <w:t xml:space="preserve"> </w:t>
+      </w:r>
+      <w:r>
+        <w:t xml:space="preserve">Analizdeki alan ayrımına uygun olarak 59 hesap sorusu ayrı</w:t>
       </w:r>
       <w:r>
         <w:t xml:space="preserve"> </w:t>
@@ -2523,7 +2804,7 @@
         <w:t xml:space="preserve">“</w:t>
       </w:r>
       <w:r>
-        <w:t xml:space="preserve">önceki işlemlerden kazanılmış indirim fiyattan düşülmez</w:t>
+        <w:t xml:space="preserve">Hesaplama</w:t>
       </w:r>
       <w:r>
         <w:t xml:space="preserve">”</w:t>
@@ -2532,7 +2813,42 @@
         <w:t xml:space="preserve"> </w:t>
       </w:r>
       <w:r>
-        <w:t xml:space="preserve">(2023/79) ve antrepo götürü teminatında</w:t>
+        <w:t xml:space="preserve">konusuna sayılınca (Gümrük Kıymeti 47 → 15, KDV 13 → 4 vb.) test dağılımı yeniden hesaplandı. Hesap sorusu 14’ten 19’a çıktı; fazla kalan konulardan 9 soru çıkarıldı, yerine 5 hesap ve 4 sözel soru yazıldı (bir soru Test 3’ten Test 2’ye taşındı). Yeni soruların hepsi bağımsız doğrulamadan (4 sözelde 3, 5 hesapta 5 düzeltme; 1 hesap sorusu yeniden yazıldı) ve kendi testleriyle çapraz kontrolden geçti. Konu başına soru sayıları yeni sınıflamanın hedefleriyle birebir aynı.</w:t>
+      </w:r>
+    </w:p>
+    <w:p>
+      <w:pPr>
+        <w:numPr>
+          <w:ilvl w:val="0"/>
+          <w:numId w:val="1005"/>
+        </w:numPr>
+        <w:pStyle w:val="Compact"/>
+      </w:pPr>
+      <w:r>
+        <w:rPr>
+          <w:bCs/>
+          <w:b/>
+        </w:rPr>
+        <w:t xml:space="preserve">İkinci set (Test 4–6):</w:t>
+      </w:r>
+      <w:r>
+        <w:t xml:space="preserve"> </w:t>
+      </w:r>
+      <w:r>
+        <w:t xml:space="preserve">150 yeni soru aynı slot dağılımıyla 16 kümede yazıldı; her yazar ilk setin 150 sorusunu ve üç denemeyi tarayıp aynı konunun sorulmamış alt başlıklarına gitti. Bağımsız küme doğrulamasında</w:t>
+      </w:r>
+      <w:r>
+        <w:t xml:space="preserve"> </w:t>
+      </w:r>
+      <w:r>
+        <w:rPr>
+          <w:bCs/>
+          <w:b/>
+        </w:rPr>
+        <w:t xml:space="preserve">118 soru değişmeden geçti, 32’si düzeltildi</w:t>
+      </w:r>
+      <w:r>
+        <w:t xml:space="preserve">; çoğu ilk setle ya da denemelerle çakışan bir çeldiricinin değiştirilmesiydi. 2 sorunun cevabı değişti: Revize PEM sonrası tartışmalı hâle gelen</w:t>
       </w:r>
       <w:r>
         <w:t xml:space="preserve"> </w:t>
@@ -2541,7 +2857,7 @@
         <w:t xml:space="preserve">“</w:t>
       </w:r>
       <w:r>
-        <w:t xml:space="preserve">açık + kapalı alan toplamı</w:t>
+        <w:t xml:space="preserve">doğrudan nakil</w:t>
       </w:r>
       <w:r>
         <w:t xml:space="preserve">”</w:t>
@@ -2550,17 +2866,59 @@
         <w:t xml:space="preserve"> </w:t>
       </w:r>
       <w:r>
-        <w:t xml:space="preserve">(2022/41, 2024/83) Kanun ve Yönetmelik metninde açıkça yazmaz; testlerde bu kurallara dayanan veri kullanılmadı.</w:t>
+        <w:t xml:space="preserve">öncülü çıkarıldı; yalnız resmî anahtara dayanan</w:t>
+      </w:r>
+      <w:r>
+        <w:t xml:space="preserve"> </w:t>
+      </w:r>
+      <w:r>
+        <w:t xml:space="preserve">“</w:t>
+      </w:r>
+      <w:r>
+        <w:t xml:space="preserve">faiz KDV matrahına girer</w:t>
+      </w:r>
+      <w:r>
+        <w:t xml:space="preserve">”</w:t>
+      </w:r>
+      <w:r>
+        <w:t xml:space="preserve"> </w:t>
+      </w:r>
+      <w:r>
+        <w:t xml:space="preserve">kuralı hesaptan çıkarıldı. Test bazında çapraz kontrolde anahtar hatası çıkmadı; 11 soru düzeltildi (3’ü ilk setle ya da denemeyle kurgu tekrarı yüzünden yeniden yazıldı, 2’sinde art arda aynı kalıpla biten cevap düzeni bozuldu). Test 5’teki bağlı hesap setinin Türkiye giderleri, ilk setteki demuraj/ardiye kurgusunu tekrar etmesin diye dampinge karşı vergiyle yeniden kuruldu. Yeniden yazılan bütün sorular ayrıca bağımsız olarak çözüldü.</w:t>
       </w:r>
     </w:p>
     <w:bookmarkEnd w:id="26"/>
-    <w:bookmarkStart w:id="27" w:name="sınırlılıklar"/>
+    <w:bookmarkStart w:id="27" w:name="güncellik-uyarıları"/>
     <w:p>
       <w:pPr>
         <w:pStyle w:val="Heading2"/>
       </w:pPr>
       <w:r>
-        <w:t xml:space="preserve">Sınırlılıklar</w:t>
+        <w:t xml:space="preserve">Güncellik uyarıları</w:t>
+      </w:r>
+    </w:p>
+    <w:p>
+      <w:pPr>
+        <w:pStyle w:val="FirstParagraph"/>
+      </w:pPr>
+      <w:r>
+        <w:t xml:space="preserve">Dokümanlar ve testler depodaki mevzuat metinlerinin son hâline göre hazırlandı. Bazı çıkmış soruların anahtarı bugün farklı çıkar; ilgili haplarda</w:t>
+      </w:r>
+      <w:r>
+        <w:t xml:space="preserve"> </w:t>
+      </w:r>
+      <w:r>
+        <w:rPr>
+          <w:bCs/>
+          <w:b/>
+        </w:rPr>
+        <w:t xml:space="preserve">Not</w:t>
+      </w:r>
+      <w:r>
+        <w:t xml:space="preserve"> </w:t>
+      </w:r>
+      <w:r>
+        <w:t xml:space="preserve">satırında yazılı:</w:t>
       </w:r>
     </w:p>
     <w:p>
@@ -2572,7 +2930,35 @@
         <w:pStyle w:val="Compact"/>
       </w:pPr>
       <w:r>
-        <w:t xml:space="preserve">Gümrük Kanunu’nun 1–107. maddeleri, Gümrük Yönetmeliği’nin kıymet/özet beyan/beyan/transit-antrepo genel hükümleri, 5607 sayılı Kanun, DTÖ Kıymet Anlaşması, TFA ve TIR Sözleşmesi metinleri depoda yok. Bu konulardaki haplar ◇ işaretli; dayanakları çıkmış soruların doğrulanmış ifadeleri.</w:t>
+        <w:rPr>
+          <w:bCs/>
+          <w:b/>
+        </w:rPr>
+        <w:t xml:space="preserve">GK 241/1:</w:t>
+      </w:r>
+      <w:r>
+        <w:t xml:space="preserve"> </w:t>
+      </w:r>
+      <w:r>
+        <w:t xml:space="preserve">Anayasa Mahkemesinin 26.03.2026 tarihli kararıyla (E.2025/269, K.2026/72) yalnız</w:t>
+      </w:r>
+      <w:r>
+        <w:t xml:space="preserve"> </w:t>
+      </w:r>
+      <w:r>
+        <w:t xml:space="preserve">“</w:t>
+      </w:r>
+      <w:r>
+        <w:t xml:space="preserve">ikincil düzenlemelere aykırılık</w:t>
+      </w:r>
+      <w:r>
+        <w:t xml:space="preserve">”</w:t>
+      </w:r>
+      <w:r>
+        <w:t xml:space="preserve"> </w:t>
+      </w:r>
+      <w:r>
+        <w:t xml:space="preserve">ibaresi iptal edildi; 241/1’deki miktar ve 241/3–6 katları yürürlükte.</w:t>
       </w:r>
     </w:p>
     <w:p>
@@ -2584,7 +2970,17 @@
         <w:pStyle w:val="Compact"/>
       </w:pPr>
       <w:r>
-        <w:t xml:space="preserve">Mevzuat durumu, depodaki kaynak dosyalardaki hâldir (son görülen değişiklik Ağustos 2026). Sınavdan önce yürürlüğe girecek değişiklikler dokümanlarda yok.</w:t>
+        <w:rPr>
+          <w:bCs/>
+          <w:b/>
+        </w:rPr>
+        <w:t xml:space="preserve">GY 94 ve 130/1:</w:t>
+      </w:r>
+      <w:r>
+        <w:t xml:space="preserve"> </w:t>
+      </w:r>
+      <w:r>
+        <w:t xml:space="preserve">Danıştay 12.08.2026 kararıyla iptal.</w:t>
       </w:r>
     </w:p>
     <w:p>
@@ -2596,7 +2992,17 @@
         <w:pStyle w:val="Compact"/>
       </w:pPr>
       <w:r>
-        <w:t xml:space="preserve">Yıllık güncellenen tutarlar (ceza, teminat, ücret tarifesi) testlerde doğru cevap yapılmadı; gerektiğinde soruda veri olarak verildi.</w:t>
+        <w:rPr>
+          <w:bCs/>
+          <w:b/>
+        </w:rPr>
+        <w:t xml:space="preserve">KDV Kanunu md. 21/1-ç (24.07.2025):</w:t>
+      </w:r>
+      <w:r>
+        <w:t xml:space="preserve"> </w:t>
+      </w:r>
+      <w:r>
+        <w:t xml:space="preserve">(I) sayılı listede teminata esas ÖTV ithalde KDV matrahına girer; 2025/15’in resmî anahtarı eski kurala dayanır.</w:t>
       </w:r>
     </w:p>
     <w:p>
@@ -2608,11 +3014,213 @@
         <w:pStyle w:val="Compact"/>
       </w:pPr>
       <w:r>
+        <w:rPr>
+          <w:bCs/>
+          <w:b/>
+        </w:rPr>
+        <w:t xml:space="preserve">2009/15481 sayılı Karar md. 62/1</w:t>
+      </w:r>
+      <w:r>
+        <w:t xml:space="preserve"> </w:t>
+      </w:r>
+      <w:r>
+        <w:t xml:space="preserve">(07.01.2026 tarihli Cumhurbaşkanı Kararı ile değişik, yürürlük 06.02.2026: posta ve hızlı kargoda gerçek kişiye gelen eşyada tek ve maktu vergi yalnız reçeteli ilaç ve takviye edici gıdaya uygulanır) ve</w:t>
+      </w:r>
+      <w:r>
+        <w:t xml:space="preserve"> </w:t>
+      </w:r>
+      <w:r>
+        <w:rPr>
+          <w:bCs/>
+          <w:b/>
+        </w:rPr>
+        <w:t xml:space="preserve">TIR Tebliği</w:t>
+      </w:r>
+      <w:r>
+        <w:t xml:space="preserve"> </w:t>
+      </w:r>
+      <w:r>
+        <w:t xml:space="preserve">(04.07.2026; md. 20/1’deki sayı sınırı sekiz) değişiklikleri.</w:t>
+      </w:r>
+    </w:p>
+    <w:p>
+      <w:pPr>
+        <w:numPr>
+          <w:ilvl w:val="0"/>
+          <w:numId w:val="1006"/>
+        </w:numPr>
+        <w:pStyle w:val="Compact"/>
+      </w:pPr>
+      <w:r>
+        <w:rPr>
+          <w:bCs/>
+          <w:b/>
+        </w:rPr>
+        <w:t xml:space="preserve">2025/9903 sayılı Karar</w:t>
+      </w:r>
+      <w:r>
+        <w:t xml:space="preserve"> </w:t>
+      </w:r>
+      <w:r>
+        <w:t xml:space="preserve">2012/3305’in yerini aldı (yatırım teşvik).</w:t>
+      </w:r>
+    </w:p>
+    <w:p>
+      <w:pPr>
+        <w:numPr>
+          <w:ilvl w:val="0"/>
+          <w:numId w:val="1006"/>
+        </w:numPr>
+        <w:pStyle w:val="Compact"/>
+      </w:pPr>
+      <w:r>
+        <w:rPr>
+          <w:bCs/>
+          <w:b/>
+        </w:rPr>
+        <w:t xml:space="preserve">Revize PEM menşe kuralları</w:t>
+      </w:r>
+      <w:r>
+        <w:t xml:space="preserve"> </w:t>
+      </w:r>
+      <w:r>
+        <w:t xml:space="preserve">(27.03.2026 yazısı): tam kümülasyona ilişkin eski bilgiler çıkarıldı.</w:t>
+      </w:r>
+    </w:p>
+    <w:p>
+      <w:pPr>
+        <w:numPr>
+          <w:ilvl w:val="0"/>
+          <w:numId w:val="1006"/>
+        </w:numPr>
+        <w:pStyle w:val="Compact"/>
+      </w:pPr>
+      <w:r>
+        <w:rPr>
+          <w:bCs/>
+          <w:b/>
+        </w:rPr>
+        <w:t xml:space="preserve">Resmî anahtarı tartışmalı sorular</w:t>
+      </w:r>
+      <w:r>
+        <w:t xml:space="preserve"> </w:t>
+      </w:r>
+      <w:r>
+        <w:t xml:space="preserve">(2021/89-90, 2022/94, 2023/57, 2023/72-73, 2023/82, 2023/98, 2024/46, 2025/12, 2025/15, 2025/16, 2025/82): haplarda resmî anahtar ve tartışma birlikte verildi; testlerde bu sorular iskelet olarak kullanılmadı.</w:t>
+      </w:r>
+    </w:p>
+    <w:p>
+      <w:pPr>
+        <w:numPr>
+          <w:ilvl w:val="0"/>
+          <w:numId w:val="1006"/>
+        </w:numPr>
+        <w:pStyle w:val="Compact"/>
+      </w:pPr>
+      <w:r>
+        <w:rPr>
+          <w:bCs/>
+          <w:b/>
+        </w:rPr>
+        <w:t xml:space="preserve">Yalnız resmî anahtara dayanan kurallar:</w:t>
+      </w:r>
+      <w:r>
+        <w:t xml:space="preserve"> </w:t>
+      </w:r>
+      <w:r>
+        <w:t xml:space="preserve">“</w:t>
+      </w:r>
+      <w:r>
+        <w:t xml:space="preserve">önceki işlemlerden kazanılmış indirim fiyattan düşülmez</w:t>
+      </w:r>
+      <w:r>
+        <w:t xml:space="preserve">”</w:t>
+      </w:r>
+      <w:r>
+        <w:t xml:space="preserve"> </w:t>
+      </w:r>
+      <w:r>
+        <w:t xml:space="preserve">(2023/79) ve antrepo götürü teminatında</w:t>
+      </w:r>
+      <w:r>
+        <w:t xml:space="preserve"> </w:t>
+      </w:r>
+      <w:r>
+        <w:t xml:space="preserve">“</w:t>
+      </w:r>
+      <w:r>
+        <w:t xml:space="preserve">açık + kapalı alan toplamı</w:t>
+      </w:r>
+      <w:r>
+        <w:t xml:space="preserve">”</w:t>
+      </w:r>
+      <w:r>
+        <w:t xml:space="preserve"> </w:t>
+      </w:r>
+      <w:r>
+        <w:t xml:space="preserve">(2022/41, 2024/83) Kanun ve Yönetmelik metninde açıkça yazmaz; testlerde bu kurallara dayanan veri kullanılmadı.</w:t>
+      </w:r>
+    </w:p>
+    <w:bookmarkEnd w:id="27"/>
+    <w:bookmarkStart w:id="28" w:name="sınırlılıklar"/>
+    <w:p>
+      <w:pPr>
+        <w:pStyle w:val="Heading2"/>
+      </w:pPr>
+      <w:r>
+        <w:t xml:space="preserve">Sınırlılıklar</w:t>
+      </w:r>
+    </w:p>
+    <w:p>
+      <w:pPr>
+        <w:numPr>
+          <w:ilvl w:val="0"/>
+          <w:numId w:val="1007"/>
+        </w:numPr>
+        <w:pStyle w:val="Compact"/>
+      </w:pPr>
+      <w:r>
+        <w:t xml:space="preserve">Gümrük Kanunu’nun 1–107. maddeleri, Gümrük Yönetmeliği’nin kıymet/özet beyan/beyan/transit-antrepo genel hükümleri, 5607 sayılı Kanun, DTÖ Kıymet Anlaşması, TFA ve TIR Sözleşmesi metinleri depoda yok. Bu konulardaki haplar ◇ işaretli; dayanakları çıkmış soruların doğrulanmış ifadeleri.</w:t>
+      </w:r>
+    </w:p>
+    <w:p>
+      <w:pPr>
+        <w:numPr>
+          <w:ilvl w:val="0"/>
+          <w:numId w:val="1007"/>
+        </w:numPr>
+        <w:pStyle w:val="Compact"/>
+      </w:pPr>
+      <w:r>
+        <w:t xml:space="preserve">Mevzuat durumu, depodaki kaynak dosyalardaki hâldir (son görülen değişiklik Ağustos 2026). Sınavdan önce yürürlüğe girecek değişiklikler dokümanlarda yok.</w:t>
+      </w:r>
+    </w:p>
+    <w:p>
+      <w:pPr>
+        <w:numPr>
+          <w:ilvl w:val="0"/>
+          <w:numId w:val="1007"/>
+        </w:numPr>
+        <w:pStyle w:val="Compact"/>
+      </w:pPr>
+      <w:r>
+        <w:t xml:space="preserve">Yıllık güncellenen tutarlar (ceza, teminat, ücret tarifesi) testlerde doğru cevap yapılmadı; gerektiğinde soruda veri olarak verildi.</w:t>
+      </w:r>
+    </w:p>
+    <w:p>
+      <w:pPr>
+        <w:numPr>
+          <w:ilvl w:val="0"/>
+          <w:numId w:val="1007"/>
+        </w:numPr>
+        <w:pStyle w:val="Compact"/>
+      </w:pPr>
+      <w:r>
         <w:t xml:space="preserve">Tarife soruları HS 2022 nomenklatürüne göre.</w:t>
       </w:r>
     </w:p>
-    <w:bookmarkEnd w:id="27"/>
     <w:bookmarkEnd w:id="28"/>
+    <w:bookmarkEnd w:id="29"/>
     <w:sectPr/>
   </w:body>
 </w:document>
@@ -2890,34 +3498,7 @@
     <w:abstractNumId w:val="991"/>
   </w:num>
   <w:num w:numId="1003">
-    <w:abstractNumId w:val="99411"/>
-    <w:lvlOverride w:ilvl="0">
-      <w:startOverride w:val="1"/>
-    </w:lvlOverride>
-    <w:lvlOverride w:ilvl="1">
-      <w:startOverride w:val="1"/>
-    </w:lvlOverride>
-    <w:lvlOverride w:ilvl="2">
-      <w:startOverride w:val="1"/>
-    </w:lvlOverride>
-    <w:lvlOverride w:ilvl="3">
-      <w:startOverride w:val="1"/>
-    </w:lvlOverride>
-    <w:lvlOverride w:ilvl="4">
-      <w:startOverride w:val="1"/>
-    </w:lvlOverride>
-    <w:lvlOverride w:ilvl="5">
-      <w:startOverride w:val="1"/>
-    </w:lvlOverride>
-    <w:lvlOverride w:ilvl="6">
-      <w:startOverride w:val="1"/>
-    </w:lvlOverride>
-    <w:lvlOverride w:ilvl="7">
-      <w:startOverride w:val="1"/>
-    </w:lvlOverride>
-    <w:lvlOverride w:ilvl="8">
-      <w:startOverride w:val="1"/>
-    </w:lvlOverride>
+    <w:abstractNumId w:val="991"/>
   </w:num>
   <w:num w:numId="1004">
     <w:abstractNumId w:val="99411"/>
@@ -2950,9 +3531,39 @@
     </w:lvlOverride>
   </w:num>
   <w:num w:numId="1005">
+    <w:abstractNumId w:val="99411"/>
+    <w:lvlOverride w:ilvl="0">
+      <w:startOverride w:val="1"/>
+    </w:lvlOverride>
+    <w:lvlOverride w:ilvl="1">
+      <w:startOverride w:val="1"/>
+    </w:lvlOverride>
+    <w:lvlOverride w:ilvl="2">
+      <w:startOverride w:val="1"/>
+    </w:lvlOverride>
+    <w:lvlOverride w:ilvl="3">
+      <w:startOverride w:val="1"/>
+    </w:lvlOverride>
+    <w:lvlOverride w:ilvl="4">
+      <w:startOverride w:val="1"/>
+    </w:lvlOverride>
+    <w:lvlOverride w:ilvl="5">
+      <w:startOverride w:val="1"/>
+    </w:lvlOverride>
+    <w:lvlOverride w:ilvl="6">
+      <w:startOverride w:val="1"/>
+    </w:lvlOverride>
+    <w:lvlOverride w:ilvl="7">
+      <w:startOverride w:val="1"/>
+    </w:lvlOverride>
+    <w:lvlOverride w:ilvl="8">
+      <w:startOverride w:val="1"/>
+    </w:lvlOverride>
+  </w:num>
+  <w:num w:numId="1006">
     <w:abstractNumId w:val="991"/>
   </w:num>
-  <w:num w:numId="1006">
+  <w:num w:numId="1007">
     <w:abstractNumId w:val="991"/>
   </w:num>
 </w:numbering>

</xml_diff>